<commit_message>
W01 SAT paper and key rebuilt to 57 items at 119.5 minutes, with both Word files
Co-Authored-By: Claude Opus 5.5 <noreply@anthropic.com>
Claude-Session: https://claude.ai/code/session_01PkCqavtmoyKZmN4An9EQC9
</commit_message>
<xml_diff>
--- a/content/W01/SAT/paper/C2_W01_SAT_recap_paper_STUDENT.docx
+++ b/content/W01/SAT/paper/C2_W01_SAT_recap_paper_STUDENT.docx
@@ -26,7 +26,7 @@
           <w:sz w:val="21"/>
           <w:szCs w:val="21"/>
         </w:rPr>
-        <w:t xml:space="preserve">Cohort 2  ·  Saturday 10 October 2026  ·  120 minutes  ·  52 items  ·  pen and paper  ·  ungraded</w:t>
+        <w:t xml:space="preserve">Cohort 2  ·  Saturday 10 October 2026  ·  120 minutes  ·  57 items  ·  pen and paper  ·  ungraded</w:t>
       </w:r>
     </w:p>
     <w:p>
@@ -1206,7 +1206,7 @@
                 <w:sz w:val="18"/>
                 <w:szCs w:val="18"/>
               </w:rPr>
-              <w:t xml:space="preserve">Q36 to Q45</w:t>
+              <w:t xml:space="preserve">Q36 to Q50</w:t>
             </w:r>
           </w:p>
         </w:tc>
@@ -1238,7 +1238,7 @@
                 <w:sz w:val="18"/>
                 <w:szCs w:val="18"/>
               </w:rPr>
-              <w:t xml:space="preserve">25</w:t>
+              <w:t xml:space="preserve">37.5</w:t>
             </w:r>
           </w:p>
         </w:tc>
@@ -1337,7 +1337,7 @@
                 <w:sz w:val="18"/>
                 <w:szCs w:val="18"/>
               </w:rPr>
-              <w:t xml:space="preserve">Q46 to Q50</w:t>
+              <w:t xml:space="preserve">Q51 to Q55</w:t>
             </w:r>
           </w:p>
         </w:tc>
@@ -1466,7 +1466,7 @@
                 <w:sz w:val="18"/>
                 <w:szCs w:val="18"/>
               </w:rPr>
-              <w:t xml:space="preserve">Q51 to Q52</w:t>
+              <w:t xml:space="preserve">Q56 to Q57</w:t>
             </w:r>
           </w:p>
         </w:tc>
@@ -6458,7 +6458,7 @@
           <w:sz w:val="21"/>
           <w:szCs w:val="21"/>
         </w:rPr>
-        <w:t xml:space="preserve">10 items, Q36 to Q45, about 25 minutes. Each set opens on one Kalpa situation. Answer each item the way it asks: circle a letter, write T or F, or write the number or the word.</w:t>
+        <w:t xml:space="preserve">15 items, Q36 to Q50, about 37.5 minutes. Each set opens on one Kalpa situation. Answer each item the way it asks: circle a letter, write T or F, or write the number or the word.</w:t>
       </w:r>
     </w:p>
     <w:tbl>
@@ -6523,6 +6523,438 @@
                 <w:szCs w:val="21"/>
               </w:rPr>
               <w:t xml:space="preserve">Kalpa Retail, two quarters. Q1: 1,000 customers, 2,400 orders, revenue Rs 48.0 lakh. Q2: 1,000 customers, 2,160 orders, revenue Rs 43.2 lakh.</w:t>
+            </w:r>
+          </w:p>
+          <w:tbl>
+            <w:tblPr>
+              <w:tblW w:type="dxa" w:w="9524"/>
+              <w:tblBorders>
+                <w:top w:val="single" w:color="auto" w:sz="4"/>
+                <w:left w:val="single" w:color="auto" w:sz="4"/>
+                <w:bottom w:val="single" w:color="auto" w:sz="4"/>
+                <w:right w:val="single" w:color="auto" w:sz="4"/>
+                <w:insideH w:val="single" w:color="auto" w:sz="4"/>
+                <w:insideV w:val="single" w:color="auto" w:sz="4"/>
+              </w:tblBorders>
+            </w:tblPr>
+            <w:tblGrid>
+              <w:gridCol w:w="2381"/>
+              <w:gridCol w:w="2381"/>
+              <w:gridCol w:w="2381"/>
+              <w:gridCol w:w="2381"/>
+            </w:tblGrid>
+            <w:tr>
+              <w:trPr>
+                <w:tblHeader/>
+              </w:trPr>
+              <w:tc>
+                <w:tcPr>
+                  <w:tcW w:type="dxa" w:w="2381"/>
+                  <w:tcBorders>
+                    <w:top w:val="single" w:color="1A0F5C" w:sz="6"/>
+                    <w:left w:val="single" w:color="1A0F5C" w:sz="6"/>
+                    <w:bottom w:val="single" w:color="1A0F5C" w:sz="6"/>
+                    <w:right w:val="single" w:color="1A0F5C" w:sz="6"/>
+                  </w:tcBorders>
+                  <w:shd w:fill="1A0F5C" w:color="auto" w:val="clear"/>
+                  <w:tcMar>
+                    <w:top w:type="dxa" w:w="90"/>
+                    <w:left w:type="dxa" w:w="140"/>
+                    <w:bottom w:type="dxa" w:w="90"/>
+                    <w:right w:type="dxa" w:w="140"/>
+                  </w:tcMar>
+                </w:tcPr>
+                <w:p>
+                  <w:pPr>
+                    <w:spacing w:after="80"/>
+                  </w:pPr>
+                  <w:r>
+                    <w:rPr>
+                      <w:b/>
+                      <w:bCs/>
+                      <w:color w:val="FFFFFF"/>
+                      <w:sz w:val="18"/>
+                      <w:szCs w:val="18"/>
+                    </w:rPr>
+                    <w:t xml:space="preserve">Quarter</w:t>
+                  </w:r>
+                </w:p>
+              </w:tc>
+              <w:tc>
+                <w:tcPr>
+                  <w:tcW w:type="dxa" w:w="2381"/>
+                  <w:tcBorders>
+                    <w:top w:val="single" w:color="1A0F5C" w:sz="6"/>
+                    <w:left w:val="single" w:color="1A0F5C" w:sz="6"/>
+                    <w:bottom w:val="single" w:color="1A0F5C" w:sz="6"/>
+                    <w:right w:val="single" w:color="1A0F5C" w:sz="6"/>
+                  </w:tcBorders>
+                  <w:shd w:fill="1A0F5C" w:color="auto" w:val="clear"/>
+                  <w:tcMar>
+                    <w:top w:type="dxa" w:w="90"/>
+                    <w:left w:type="dxa" w:w="140"/>
+                    <w:bottom w:type="dxa" w:w="90"/>
+                    <w:right w:type="dxa" w:w="140"/>
+                  </w:tcMar>
+                </w:tcPr>
+                <w:p>
+                  <w:pPr>
+                    <w:spacing w:after="80"/>
+                  </w:pPr>
+                  <w:r>
+                    <w:rPr>
+                      <w:b/>
+                      <w:bCs/>
+                      <w:color w:val="FFFFFF"/>
+                      <w:sz w:val="18"/>
+                      <w:szCs w:val="18"/>
+                    </w:rPr>
+                    <w:t xml:space="preserve">Customers</w:t>
+                  </w:r>
+                </w:p>
+              </w:tc>
+              <w:tc>
+                <w:tcPr>
+                  <w:tcW w:type="dxa" w:w="2381"/>
+                  <w:tcBorders>
+                    <w:top w:val="single" w:color="1A0F5C" w:sz="6"/>
+                    <w:left w:val="single" w:color="1A0F5C" w:sz="6"/>
+                    <w:bottom w:val="single" w:color="1A0F5C" w:sz="6"/>
+                    <w:right w:val="single" w:color="1A0F5C" w:sz="6"/>
+                  </w:tcBorders>
+                  <w:shd w:fill="1A0F5C" w:color="auto" w:val="clear"/>
+                  <w:tcMar>
+                    <w:top w:type="dxa" w:w="90"/>
+                    <w:left w:type="dxa" w:w="140"/>
+                    <w:bottom w:type="dxa" w:w="90"/>
+                    <w:right w:type="dxa" w:w="140"/>
+                  </w:tcMar>
+                </w:tcPr>
+                <w:p>
+                  <w:pPr>
+                    <w:spacing w:after="80"/>
+                  </w:pPr>
+                  <w:r>
+                    <w:rPr>
+                      <w:b/>
+                      <w:bCs/>
+                      <w:color w:val="FFFFFF"/>
+                      <w:sz w:val="18"/>
+                      <w:szCs w:val="18"/>
+                    </w:rPr>
+                    <w:t xml:space="preserve">Orders</w:t>
+                  </w:r>
+                </w:p>
+              </w:tc>
+              <w:tc>
+                <w:tcPr>
+                  <w:tcW w:type="dxa" w:w="2381"/>
+                  <w:tcBorders>
+                    <w:top w:val="single" w:color="1A0F5C" w:sz="6"/>
+                    <w:left w:val="single" w:color="1A0F5C" w:sz="6"/>
+                    <w:bottom w:val="single" w:color="1A0F5C" w:sz="6"/>
+                    <w:right w:val="single" w:color="1A0F5C" w:sz="6"/>
+                  </w:tcBorders>
+                  <w:shd w:fill="1A0F5C" w:color="auto" w:val="clear"/>
+                  <w:tcMar>
+                    <w:top w:type="dxa" w:w="90"/>
+                    <w:left w:type="dxa" w:w="140"/>
+                    <w:bottom w:type="dxa" w:w="90"/>
+                    <w:right w:type="dxa" w:w="140"/>
+                  </w:tcMar>
+                </w:tcPr>
+                <w:p>
+                  <w:pPr>
+                    <w:spacing w:after="80"/>
+                  </w:pPr>
+                  <w:r>
+                    <w:rPr>
+                      <w:b/>
+                      <w:bCs/>
+                      <w:color w:val="FFFFFF"/>
+                      <w:sz w:val="18"/>
+                      <w:szCs w:val="18"/>
+                    </w:rPr>
+                    <w:t xml:space="preserve">Revenue</w:t>
+                  </w:r>
+                </w:p>
+              </w:tc>
+            </w:tr>
+            <w:tr>
+              <w:tc>
+                <w:tcPr>
+                  <w:tcW w:type="dxa" w:w="2381"/>
+                  <w:tcBorders>
+                    <w:top w:val="single" w:color="CFC9EE" w:sz="6"/>
+                    <w:left w:val="single" w:color="CFC9EE" w:sz="6"/>
+                    <w:bottom w:val="single" w:color="CFC9EE" w:sz="6"/>
+                    <w:right w:val="single" w:color="CFC9EE" w:sz="6"/>
+                  </w:tcBorders>
+                  <w:tcMar>
+                    <w:top w:type="dxa" w:w="90"/>
+                    <w:left w:type="dxa" w:w="140"/>
+                    <w:bottom w:type="dxa" w:w="90"/>
+                    <w:right w:type="dxa" w:w="140"/>
+                  </w:tcMar>
+                </w:tcPr>
+                <w:p>
+                  <w:pPr>
+                    <w:spacing w:after="80"/>
+                  </w:pPr>
+                  <w:r>
+                    <w:rPr>
+                      <w:color w:val="1A0F5C"/>
+                      <w:sz w:val="18"/>
+                      <w:szCs w:val="18"/>
+                    </w:rPr>
+                    <w:t xml:space="preserve">Q1</w:t>
+                  </w:r>
+                </w:p>
+              </w:tc>
+              <w:tc>
+                <w:tcPr>
+                  <w:tcW w:type="dxa" w:w="2381"/>
+                  <w:tcBorders>
+                    <w:top w:val="single" w:color="CFC9EE" w:sz="6"/>
+                    <w:left w:val="single" w:color="CFC9EE" w:sz="6"/>
+                    <w:bottom w:val="single" w:color="CFC9EE" w:sz="6"/>
+                    <w:right w:val="single" w:color="CFC9EE" w:sz="6"/>
+                  </w:tcBorders>
+                  <w:tcMar>
+                    <w:top w:type="dxa" w:w="90"/>
+                    <w:left w:type="dxa" w:w="140"/>
+                    <w:bottom w:type="dxa" w:w="90"/>
+                    <w:right w:type="dxa" w:w="140"/>
+                  </w:tcMar>
+                </w:tcPr>
+                <w:p>
+                  <w:pPr>
+                    <w:spacing w:after="80"/>
+                  </w:pPr>
+                  <w:r>
+                    <w:rPr>
+                      <w:b w:val="false"/>
+                      <w:bCs w:val="false"/>
+                      <w:color w:val="1A0F5C"/>
+                      <w:sz w:val="18"/>
+                      <w:szCs w:val="18"/>
+                    </w:rPr>
+                    <w:t xml:space="preserve">1,000</w:t>
+                  </w:r>
+                </w:p>
+              </w:tc>
+              <w:tc>
+                <w:tcPr>
+                  <w:tcW w:type="dxa" w:w="2381"/>
+                  <w:tcBorders>
+                    <w:top w:val="single" w:color="CFC9EE" w:sz="6"/>
+                    <w:left w:val="single" w:color="CFC9EE" w:sz="6"/>
+                    <w:bottom w:val="single" w:color="CFC9EE" w:sz="6"/>
+                    <w:right w:val="single" w:color="CFC9EE" w:sz="6"/>
+                  </w:tcBorders>
+                  <w:tcMar>
+                    <w:top w:type="dxa" w:w="90"/>
+                    <w:left w:type="dxa" w:w="140"/>
+                    <w:bottom w:type="dxa" w:w="90"/>
+                    <w:right w:type="dxa" w:w="140"/>
+                  </w:tcMar>
+                </w:tcPr>
+                <w:p>
+                  <w:pPr>
+                    <w:spacing w:after="80"/>
+                  </w:pPr>
+                  <w:r>
+                    <w:rPr>
+                      <w:b w:val="false"/>
+                      <w:bCs w:val="false"/>
+                      <w:color w:val="1A0F5C"/>
+                      <w:sz w:val="18"/>
+                      <w:szCs w:val="18"/>
+                    </w:rPr>
+                    <w:t xml:space="preserve">2,400</w:t>
+                  </w:r>
+                </w:p>
+              </w:tc>
+              <w:tc>
+                <w:tcPr>
+                  <w:tcW w:type="dxa" w:w="2381"/>
+                  <w:tcBorders>
+                    <w:top w:val="single" w:color="CFC9EE" w:sz="6"/>
+                    <w:left w:val="single" w:color="CFC9EE" w:sz="6"/>
+                    <w:bottom w:val="single" w:color="CFC9EE" w:sz="6"/>
+                    <w:right w:val="single" w:color="CFC9EE" w:sz="6"/>
+                  </w:tcBorders>
+                  <w:tcMar>
+                    <w:top w:type="dxa" w:w="90"/>
+                    <w:left w:type="dxa" w:w="140"/>
+                    <w:bottom w:type="dxa" w:w="90"/>
+                    <w:right w:type="dxa" w:w="140"/>
+                  </w:tcMar>
+                </w:tcPr>
+                <w:p>
+                  <w:pPr>
+                    <w:spacing w:after="80"/>
+                  </w:pPr>
+                  <w:r>
+                    <w:rPr>
+                      <w:b w:val="false"/>
+                      <w:bCs w:val="false"/>
+                      <w:color w:val="1A0F5C"/>
+                      <w:sz w:val="18"/>
+                      <w:szCs w:val="18"/>
+                    </w:rPr>
+                    <w:t xml:space="preserve">Rs 48.0 lakh</w:t>
+                  </w:r>
+                </w:p>
+              </w:tc>
+            </w:tr>
+            <w:tr>
+              <w:tc>
+                <w:tcPr>
+                  <w:tcW w:type="dxa" w:w="2381"/>
+                  <w:tcBorders>
+                    <w:top w:val="single" w:color="CFC9EE" w:sz="6"/>
+                    <w:left w:val="single" w:color="CFC9EE" w:sz="6"/>
+                    <w:bottom w:val="single" w:color="CFC9EE" w:sz="6"/>
+                    <w:right w:val="single" w:color="CFC9EE" w:sz="6"/>
+                  </w:tcBorders>
+                  <w:shd w:fill="F4F2FA" w:color="auto" w:val="clear"/>
+                  <w:tcMar>
+                    <w:top w:type="dxa" w:w="90"/>
+                    <w:left w:type="dxa" w:w="140"/>
+                    <w:bottom w:type="dxa" w:w="90"/>
+                    <w:right w:type="dxa" w:w="140"/>
+                  </w:tcMar>
+                </w:tcPr>
+                <w:p>
+                  <w:pPr>
+                    <w:spacing w:after="80"/>
+                  </w:pPr>
+                  <w:r>
+                    <w:rPr>
+                      <w:color w:val="1A0F5C"/>
+                      <w:sz w:val="18"/>
+                      <w:szCs w:val="18"/>
+                    </w:rPr>
+                    <w:t xml:space="preserve">Q2</w:t>
+                  </w:r>
+                </w:p>
+              </w:tc>
+              <w:tc>
+                <w:tcPr>
+                  <w:tcW w:type="dxa" w:w="2381"/>
+                  <w:tcBorders>
+                    <w:top w:val="single" w:color="CFC9EE" w:sz="6"/>
+                    <w:left w:val="single" w:color="CFC9EE" w:sz="6"/>
+                    <w:bottom w:val="single" w:color="CFC9EE" w:sz="6"/>
+                    <w:right w:val="single" w:color="CFC9EE" w:sz="6"/>
+                  </w:tcBorders>
+                  <w:shd w:fill="F4F2FA" w:color="auto" w:val="clear"/>
+                  <w:tcMar>
+                    <w:top w:type="dxa" w:w="90"/>
+                    <w:left w:type="dxa" w:w="140"/>
+                    <w:bottom w:type="dxa" w:w="90"/>
+                    <w:right w:type="dxa" w:w="140"/>
+                  </w:tcMar>
+                </w:tcPr>
+                <w:p>
+                  <w:pPr>
+                    <w:spacing w:after="80"/>
+                  </w:pPr>
+                  <w:r>
+                    <w:rPr>
+                      <w:b w:val="false"/>
+                      <w:bCs w:val="false"/>
+                      <w:color w:val="1A0F5C"/>
+                      <w:sz w:val="18"/>
+                      <w:szCs w:val="18"/>
+                    </w:rPr>
+                    <w:t xml:space="preserve">1,000</w:t>
+                  </w:r>
+                </w:p>
+              </w:tc>
+              <w:tc>
+                <w:tcPr>
+                  <w:tcW w:type="dxa" w:w="2381"/>
+                  <w:tcBorders>
+                    <w:top w:val="single" w:color="CFC9EE" w:sz="6"/>
+                    <w:left w:val="single" w:color="CFC9EE" w:sz="6"/>
+                    <w:bottom w:val="single" w:color="CFC9EE" w:sz="6"/>
+                    <w:right w:val="single" w:color="CFC9EE" w:sz="6"/>
+                  </w:tcBorders>
+                  <w:shd w:fill="F4F2FA" w:color="auto" w:val="clear"/>
+                  <w:tcMar>
+                    <w:top w:type="dxa" w:w="90"/>
+                    <w:left w:type="dxa" w:w="140"/>
+                    <w:bottom w:type="dxa" w:w="90"/>
+                    <w:right w:type="dxa" w:w="140"/>
+                  </w:tcMar>
+                </w:tcPr>
+                <w:p>
+                  <w:pPr>
+                    <w:spacing w:after="80"/>
+                  </w:pPr>
+                  <w:r>
+                    <w:rPr>
+                      <w:b w:val="false"/>
+                      <w:bCs w:val="false"/>
+                      <w:color w:val="1A0F5C"/>
+                      <w:sz w:val="18"/>
+                      <w:szCs w:val="18"/>
+                    </w:rPr>
+                    <w:t xml:space="preserve">2,160</w:t>
+                  </w:r>
+                </w:p>
+              </w:tc>
+              <w:tc>
+                <w:tcPr>
+                  <w:tcW w:type="dxa" w:w="2381"/>
+                  <w:tcBorders>
+                    <w:top w:val="single" w:color="CFC9EE" w:sz="6"/>
+                    <w:left w:val="single" w:color="CFC9EE" w:sz="6"/>
+                    <w:bottom w:val="single" w:color="CFC9EE" w:sz="6"/>
+                    <w:right w:val="single" w:color="CFC9EE" w:sz="6"/>
+                  </w:tcBorders>
+                  <w:shd w:fill="F4F2FA" w:color="auto" w:val="clear"/>
+                  <w:tcMar>
+                    <w:top w:type="dxa" w:w="90"/>
+                    <w:left w:type="dxa" w:w="140"/>
+                    <w:bottom w:type="dxa" w:w="90"/>
+                    <w:right w:type="dxa" w:w="140"/>
+                  </w:tcMar>
+                </w:tcPr>
+                <w:p>
+                  <w:pPr>
+                    <w:spacing w:after="80"/>
+                  </w:pPr>
+                  <w:r>
+                    <w:rPr>
+                      <w:b w:val="false"/>
+                      <w:bCs w:val="false"/>
+                      <w:color w:val="1A0F5C"/>
+                      <w:sz w:val="18"/>
+                      <w:szCs w:val="18"/>
+                    </w:rPr>
+                    <w:t xml:space="preserve">Rs 43.2 lakh</w:t>
+                  </w:r>
+                </w:p>
+              </w:tc>
+            </w:tr>
+          </w:tbl>
+          <w:p>
+            <w:pPr>
+              <w:spacing w:after="80"/>
+              <w:jc w:val="center"/>
+            </w:pPr>
+            <w:r>
+              <w:rPr>
+                <w:i/>
+                <w:iCs/>
+                <w:color w:val="6B6690"/>
+                <w:sz w:val="18"/>
+                <w:szCs w:val="18"/>
+              </w:rPr>
+              <w:t xml:space="preserve">Kalpa Retail, the two quarters as the situation gives them.</w:t>
             </w:r>
           </w:p>
         </w:tc>
@@ -7214,6 +7646,370 @@
               <w:t xml:space="preserve">The ERP export holds 214 rows. Your cleaning run removes 14 exact duplicates and rejects 3 more rows: one amount spelt as a word, one row missing a required field and one truncated line. Every removed row goes to the rejects log with its reason.</w:t>
             </w:r>
           </w:p>
+          <w:tbl>
+            <w:tblPr>
+              <w:tblW w:type="dxa" w:w="9526"/>
+              <w:tblBorders>
+                <w:top w:val="single" w:color="auto" w:sz="4"/>
+                <w:left w:val="single" w:color="auto" w:sz="4"/>
+                <w:bottom w:val="single" w:color="auto" w:sz="4"/>
+                <w:right w:val="single" w:color="auto" w:sz="4"/>
+                <w:insideH w:val="single" w:color="auto" w:sz="4"/>
+                <w:insideV w:val="single" w:color="auto" w:sz="4"/>
+              </w:tblBorders>
+            </w:tblPr>
+            <w:tblGrid>
+              <w:gridCol w:w="4763"/>
+              <w:gridCol w:w="4763"/>
+            </w:tblGrid>
+            <w:tr>
+              <w:trPr>
+                <w:tblHeader/>
+              </w:trPr>
+              <w:tc>
+                <w:tcPr>
+                  <w:tcW w:type="dxa" w:w="4763"/>
+                  <w:tcBorders>
+                    <w:top w:val="single" w:color="1A0F5C" w:sz="6"/>
+                    <w:left w:val="single" w:color="1A0F5C" w:sz="6"/>
+                    <w:bottom w:val="single" w:color="1A0F5C" w:sz="6"/>
+                    <w:right w:val="single" w:color="1A0F5C" w:sz="6"/>
+                  </w:tcBorders>
+                  <w:shd w:fill="1A0F5C" w:color="auto" w:val="clear"/>
+                  <w:tcMar>
+                    <w:top w:type="dxa" w:w="90"/>
+                    <w:left w:type="dxa" w:w="140"/>
+                    <w:bottom w:type="dxa" w:w="90"/>
+                    <w:right w:type="dxa" w:w="140"/>
+                  </w:tcMar>
+                </w:tcPr>
+                <w:p>
+                  <w:pPr>
+                    <w:spacing w:after="80"/>
+                  </w:pPr>
+                  <w:r>
+                    <w:rPr>
+                      <w:b/>
+                      <w:bCs/>
+                      <w:color w:val="FFFFFF"/>
+                      <w:sz w:val="18"/>
+                      <w:szCs w:val="18"/>
+                    </w:rPr>
+                    <w:t xml:space="preserve">What left the ERP export</w:t>
+                  </w:r>
+                </w:p>
+              </w:tc>
+              <w:tc>
+                <w:tcPr>
+                  <w:tcW w:type="dxa" w:w="4763"/>
+                  <w:tcBorders>
+                    <w:top w:val="single" w:color="1A0F5C" w:sz="6"/>
+                    <w:left w:val="single" w:color="1A0F5C" w:sz="6"/>
+                    <w:bottom w:val="single" w:color="1A0F5C" w:sz="6"/>
+                    <w:right w:val="single" w:color="1A0F5C" w:sz="6"/>
+                  </w:tcBorders>
+                  <w:shd w:fill="1A0F5C" w:color="auto" w:val="clear"/>
+                  <w:tcMar>
+                    <w:top w:type="dxa" w:w="90"/>
+                    <w:left w:type="dxa" w:w="140"/>
+                    <w:bottom w:type="dxa" w:w="90"/>
+                    <w:right w:type="dxa" w:w="140"/>
+                  </w:tcMar>
+                </w:tcPr>
+                <w:p>
+                  <w:pPr>
+                    <w:spacing w:after="80"/>
+                  </w:pPr>
+                  <w:r>
+                    <w:rPr>
+                      <w:b/>
+                      <w:bCs/>
+                      <w:color w:val="FFFFFF"/>
+                      <w:sz w:val="18"/>
+                      <w:szCs w:val="18"/>
+                    </w:rPr>
+                    <w:t xml:space="preserve">Rows</w:t>
+                  </w:r>
+                </w:p>
+              </w:tc>
+            </w:tr>
+            <w:tr>
+              <w:tc>
+                <w:tcPr>
+                  <w:tcW w:type="dxa" w:w="4763"/>
+                  <w:tcBorders>
+                    <w:top w:val="single" w:color="CFC9EE" w:sz="6"/>
+                    <w:left w:val="single" w:color="CFC9EE" w:sz="6"/>
+                    <w:bottom w:val="single" w:color="CFC9EE" w:sz="6"/>
+                    <w:right w:val="single" w:color="CFC9EE" w:sz="6"/>
+                  </w:tcBorders>
+                  <w:tcMar>
+                    <w:top w:type="dxa" w:w="90"/>
+                    <w:left w:type="dxa" w:w="140"/>
+                    <w:bottom w:type="dxa" w:w="90"/>
+                    <w:right w:type="dxa" w:w="140"/>
+                  </w:tcMar>
+                </w:tcPr>
+                <w:p>
+                  <w:pPr>
+                    <w:spacing w:after="80"/>
+                  </w:pPr>
+                  <w:r>
+                    <w:rPr>
+                      <w:color w:val="1A0F5C"/>
+                      <w:sz w:val="18"/>
+                      <w:szCs w:val="18"/>
+                    </w:rPr>
+                    <w:t xml:space="preserve">Exact duplicates</w:t>
+                  </w:r>
+                </w:p>
+              </w:tc>
+              <w:tc>
+                <w:tcPr>
+                  <w:tcW w:type="dxa" w:w="4763"/>
+                  <w:tcBorders>
+                    <w:top w:val="single" w:color="CFC9EE" w:sz="6"/>
+                    <w:left w:val="single" w:color="CFC9EE" w:sz="6"/>
+                    <w:bottom w:val="single" w:color="CFC9EE" w:sz="6"/>
+                    <w:right w:val="single" w:color="CFC9EE" w:sz="6"/>
+                  </w:tcBorders>
+                  <w:tcMar>
+                    <w:top w:type="dxa" w:w="90"/>
+                    <w:left w:type="dxa" w:w="140"/>
+                    <w:bottom w:type="dxa" w:w="90"/>
+                    <w:right w:type="dxa" w:w="140"/>
+                  </w:tcMar>
+                </w:tcPr>
+                <w:p>
+                  <w:pPr>
+                    <w:spacing w:after="80"/>
+                  </w:pPr>
+                  <w:r>
+                    <w:rPr>
+                      <w:b w:val="false"/>
+                      <w:bCs w:val="false"/>
+                      <w:color w:val="1A0F5C"/>
+                      <w:sz w:val="18"/>
+                      <w:szCs w:val="18"/>
+                    </w:rPr>
+                    <w:t xml:space="preserve">14</w:t>
+                  </w:r>
+                </w:p>
+              </w:tc>
+            </w:tr>
+            <w:tr>
+              <w:tc>
+                <w:tcPr>
+                  <w:tcW w:type="dxa" w:w="4763"/>
+                  <w:tcBorders>
+                    <w:top w:val="single" w:color="CFC9EE" w:sz="6"/>
+                    <w:left w:val="single" w:color="CFC9EE" w:sz="6"/>
+                    <w:bottom w:val="single" w:color="CFC9EE" w:sz="6"/>
+                    <w:right w:val="single" w:color="CFC9EE" w:sz="6"/>
+                  </w:tcBorders>
+                  <w:shd w:fill="F4F2FA" w:color="auto" w:val="clear"/>
+                  <w:tcMar>
+                    <w:top w:type="dxa" w:w="90"/>
+                    <w:left w:type="dxa" w:w="140"/>
+                    <w:bottom w:type="dxa" w:w="90"/>
+                    <w:right w:type="dxa" w:w="140"/>
+                  </w:tcMar>
+                </w:tcPr>
+                <w:p>
+                  <w:pPr>
+                    <w:spacing w:after="80"/>
+                  </w:pPr>
+                  <w:r>
+                    <w:rPr>
+                      <w:color w:val="1A0F5C"/>
+                      <w:sz w:val="18"/>
+                      <w:szCs w:val="18"/>
+                    </w:rPr>
+                    <w:t xml:space="preserve">Amount spelt as a word</w:t>
+                  </w:r>
+                </w:p>
+              </w:tc>
+              <w:tc>
+                <w:tcPr>
+                  <w:tcW w:type="dxa" w:w="4763"/>
+                  <w:tcBorders>
+                    <w:top w:val="single" w:color="CFC9EE" w:sz="6"/>
+                    <w:left w:val="single" w:color="CFC9EE" w:sz="6"/>
+                    <w:bottom w:val="single" w:color="CFC9EE" w:sz="6"/>
+                    <w:right w:val="single" w:color="CFC9EE" w:sz="6"/>
+                  </w:tcBorders>
+                  <w:shd w:fill="F4F2FA" w:color="auto" w:val="clear"/>
+                  <w:tcMar>
+                    <w:top w:type="dxa" w:w="90"/>
+                    <w:left w:type="dxa" w:w="140"/>
+                    <w:bottom w:type="dxa" w:w="90"/>
+                    <w:right w:type="dxa" w:w="140"/>
+                  </w:tcMar>
+                </w:tcPr>
+                <w:p>
+                  <w:pPr>
+                    <w:spacing w:after="80"/>
+                  </w:pPr>
+                  <w:r>
+                    <w:rPr>
+                      <w:b w:val="false"/>
+                      <w:bCs w:val="false"/>
+                      <w:color w:val="1A0F5C"/>
+                      <w:sz w:val="18"/>
+                      <w:szCs w:val="18"/>
+                    </w:rPr>
+                    <w:t xml:space="preserve">1</w:t>
+                  </w:r>
+                </w:p>
+              </w:tc>
+            </w:tr>
+            <w:tr>
+              <w:tc>
+                <w:tcPr>
+                  <w:tcW w:type="dxa" w:w="4763"/>
+                  <w:tcBorders>
+                    <w:top w:val="single" w:color="CFC9EE" w:sz="6"/>
+                    <w:left w:val="single" w:color="CFC9EE" w:sz="6"/>
+                    <w:bottom w:val="single" w:color="CFC9EE" w:sz="6"/>
+                    <w:right w:val="single" w:color="CFC9EE" w:sz="6"/>
+                  </w:tcBorders>
+                  <w:tcMar>
+                    <w:top w:type="dxa" w:w="90"/>
+                    <w:left w:type="dxa" w:w="140"/>
+                    <w:bottom w:type="dxa" w:w="90"/>
+                    <w:right w:type="dxa" w:w="140"/>
+                  </w:tcMar>
+                </w:tcPr>
+                <w:p>
+                  <w:pPr>
+                    <w:spacing w:after="80"/>
+                  </w:pPr>
+                  <w:r>
+                    <w:rPr>
+                      <w:color w:val="1A0F5C"/>
+                      <w:sz w:val="18"/>
+                      <w:szCs w:val="18"/>
+                    </w:rPr>
+                    <w:t xml:space="preserve">Missing required field</w:t>
+                  </w:r>
+                </w:p>
+              </w:tc>
+              <w:tc>
+                <w:tcPr>
+                  <w:tcW w:type="dxa" w:w="4763"/>
+                  <w:tcBorders>
+                    <w:top w:val="single" w:color="CFC9EE" w:sz="6"/>
+                    <w:left w:val="single" w:color="CFC9EE" w:sz="6"/>
+                    <w:bottom w:val="single" w:color="CFC9EE" w:sz="6"/>
+                    <w:right w:val="single" w:color="CFC9EE" w:sz="6"/>
+                  </w:tcBorders>
+                  <w:tcMar>
+                    <w:top w:type="dxa" w:w="90"/>
+                    <w:left w:type="dxa" w:w="140"/>
+                    <w:bottom w:type="dxa" w:w="90"/>
+                    <w:right w:type="dxa" w:w="140"/>
+                  </w:tcMar>
+                </w:tcPr>
+                <w:p>
+                  <w:pPr>
+                    <w:spacing w:after="80"/>
+                  </w:pPr>
+                  <w:r>
+                    <w:rPr>
+                      <w:b w:val="false"/>
+                      <w:bCs w:val="false"/>
+                      <w:color w:val="1A0F5C"/>
+                      <w:sz w:val="18"/>
+                      <w:szCs w:val="18"/>
+                    </w:rPr>
+                    <w:t xml:space="preserve">1</w:t>
+                  </w:r>
+                </w:p>
+              </w:tc>
+            </w:tr>
+            <w:tr>
+              <w:tc>
+                <w:tcPr>
+                  <w:tcW w:type="dxa" w:w="4763"/>
+                  <w:tcBorders>
+                    <w:top w:val="single" w:color="CFC9EE" w:sz="6"/>
+                    <w:left w:val="single" w:color="CFC9EE" w:sz="6"/>
+                    <w:bottom w:val="single" w:color="CFC9EE" w:sz="6"/>
+                    <w:right w:val="single" w:color="CFC9EE" w:sz="6"/>
+                  </w:tcBorders>
+                  <w:shd w:fill="F4F2FA" w:color="auto" w:val="clear"/>
+                  <w:tcMar>
+                    <w:top w:type="dxa" w:w="90"/>
+                    <w:left w:type="dxa" w:w="140"/>
+                    <w:bottom w:type="dxa" w:w="90"/>
+                    <w:right w:type="dxa" w:w="140"/>
+                  </w:tcMar>
+                </w:tcPr>
+                <w:p>
+                  <w:pPr>
+                    <w:spacing w:after="80"/>
+                  </w:pPr>
+                  <w:r>
+                    <w:rPr>
+                      <w:color w:val="1A0F5C"/>
+                      <w:sz w:val="18"/>
+                      <w:szCs w:val="18"/>
+                    </w:rPr>
+                    <w:t xml:space="preserve">Truncated line</w:t>
+                  </w:r>
+                </w:p>
+              </w:tc>
+              <w:tc>
+                <w:tcPr>
+                  <w:tcW w:type="dxa" w:w="4763"/>
+                  <w:tcBorders>
+                    <w:top w:val="single" w:color="CFC9EE" w:sz="6"/>
+                    <w:left w:val="single" w:color="CFC9EE" w:sz="6"/>
+                    <w:bottom w:val="single" w:color="CFC9EE" w:sz="6"/>
+                    <w:right w:val="single" w:color="CFC9EE" w:sz="6"/>
+                  </w:tcBorders>
+                  <w:shd w:fill="F4F2FA" w:color="auto" w:val="clear"/>
+                  <w:tcMar>
+                    <w:top w:type="dxa" w:w="90"/>
+                    <w:left w:type="dxa" w:w="140"/>
+                    <w:bottom w:type="dxa" w:w="90"/>
+                    <w:right w:type="dxa" w:w="140"/>
+                  </w:tcMar>
+                </w:tcPr>
+                <w:p>
+                  <w:pPr>
+                    <w:spacing w:after="80"/>
+                  </w:pPr>
+                  <w:r>
+                    <w:rPr>
+                      <w:b w:val="false"/>
+                      <w:bCs w:val="false"/>
+                      <w:color w:val="1A0F5C"/>
+                      <w:sz w:val="18"/>
+                      <w:szCs w:val="18"/>
+                    </w:rPr>
+                    <w:t xml:space="preserve">1</w:t>
+                  </w:r>
+                </w:p>
+              </w:tc>
+            </w:tr>
+          </w:tbl>
+          <w:p>
+            <w:pPr>
+              <w:spacing w:after="80"/>
+              <w:jc w:val="center"/>
+            </w:pPr>
+            <w:r>
+              <w:rPr>
+                <w:i/>
+                <w:iCs/>
+                <w:color w:val="6B6690"/>
+                <w:sz w:val="18"/>
+                <w:szCs w:val="18"/>
+              </w:rPr>
+              <w:t xml:space="preserve">The 214 rows of the ERP export, and what the cleaning run took out of them.</w:t>
+            </w:r>
+          </w:p>
         </w:tc>
       </w:tr>
     </w:tbl>
@@ -7645,6 +8441,304 @@
               <w:t xml:space="preserve">After the monsoon discount, total revenue rose 6 percent. Split by segment, revenue per customer fell in every segment. The customers who received the discount were, on average, more frequent buyers than those who did not.</w:t>
             </w:r>
           </w:p>
+          <w:tbl>
+            <w:tblPr>
+              <w:tblW w:type="dxa" w:w="9526"/>
+              <w:tblBorders>
+                <w:top w:val="single" w:color="auto" w:sz="4"/>
+                <w:left w:val="single" w:color="auto" w:sz="4"/>
+                <w:bottom w:val="single" w:color="auto" w:sz="4"/>
+                <w:right w:val="single" w:color="auto" w:sz="4"/>
+                <w:insideH w:val="single" w:color="auto" w:sz="4"/>
+                <w:insideV w:val="single" w:color="auto" w:sz="4"/>
+              </w:tblBorders>
+            </w:tblPr>
+            <w:tblGrid>
+              <w:gridCol w:w="4763"/>
+              <w:gridCol w:w="4763"/>
+            </w:tblGrid>
+            <w:tr>
+              <w:trPr>
+                <w:tblHeader/>
+              </w:trPr>
+              <w:tc>
+                <w:tcPr>
+                  <w:tcW w:type="dxa" w:w="4763"/>
+                  <w:tcBorders>
+                    <w:top w:val="single" w:color="1A0F5C" w:sz="6"/>
+                    <w:left w:val="single" w:color="1A0F5C" w:sz="6"/>
+                    <w:bottom w:val="single" w:color="1A0F5C" w:sz="6"/>
+                    <w:right w:val="single" w:color="1A0F5C" w:sz="6"/>
+                  </w:tcBorders>
+                  <w:shd w:fill="1A0F5C" w:color="auto" w:val="clear"/>
+                  <w:tcMar>
+                    <w:top w:type="dxa" w:w="90"/>
+                    <w:left w:type="dxa" w:w="140"/>
+                    <w:bottom w:type="dxa" w:w="90"/>
+                    <w:right w:type="dxa" w:w="140"/>
+                  </w:tcMar>
+                </w:tcPr>
+                <w:p>
+                  <w:pPr>
+                    <w:spacing w:after="80"/>
+                  </w:pPr>
+                  <w:r>
+                    <w:rPr>
+                      <w:b/>
+                      <w:bCs/>
+                      <w:color w:val="FFFFFF"/>
+                      <w:sz w:val="18"/>
+                      <w:szCs w:val="18"/>
+                    </w:rPr>
+                    <w:t xml:space="preserve">What was measured</w:t>
+                  </w:r>
+                </w:p>
+              </w:tc>
+              <w:tc>
+                <w:tcPr>
+                  <w:tcW w:type="dxa" w:w="4763"/>
+                  <w:tcBorders>
+                    <w:top w:val="single" w:color="1A0F5C" w:sz="6"/>
+                    <w:left w:val="single" w:color="1A0F5C" w:sz="6"/>
+                    <w:bottom w:val="single" w:color="1A0F5C" w:sz="6"/>
+                    <w:right w:val="single" w:color="1A0F5C" w:sz="6"/>
+                  </w:tcBorders>
+                  <w:shd w:fill="1A0F5C" w:color="auto" w:val="clear"/>
+                  <w:tcMar>
+                    <w:top w:type="dxa" w:w="90"/>
+                    <w:left w:type="dxa" w:w="140"/>
+                    <w:bottom w:type="dxa" w:w="90"/>
+                    <w:right w:type="dxa" w:w="140"/>
+                  </w:tcMar>
+                </w:tcPr>
+                <w:p>
+                  <w:pPr>
+                    <w:spacing w:after="80"/>
+                  </w:pPr>
+                  <w:r>
+                    <w:rPr>
+                      <w:b/>
+                      <w:bCs/>
+                      <w:color w:val="FFFFFF"/>
+                      <w:sz w:val="18"/>
+                      <w:szCs w:val="18"/>
+                    </w:rPr>
+                    <w:t xml:space="preserve">What it showed</w:t>
+                  </w:r>
+                </w:p>
+              </w:tc>
+            </w:tr>
+            <w:tr>
+              <w:tc>
+                <w:tcPr>
+                  <w:tcW w:type="dxa" w:w="4763"/>
+                  <w:tcBorders>
+                    <w:top w:val="single" w:color="CFC9EE" w:sz="6"/>
+                    <w:left w:val="single" w:color="CFC9EE" w:sz="6"/>
+                    <w:bottom w:val="single" w:color="CFC9EE" w:sz="6"/>
+                    <w:right w:val="single" w:color="CFC9EE" w:sz="6"/>
+                  </w:tcBorders>
+                  <w:tcMar>
+                    <w:top w:type="dxa" w:w="90"/>
+                    <w:left w:type="dxa" w:w="140"/>
+                    <w:bottom w:type="dxa" w:w="90"/>
+                    <w:right w:type="dxa" w:w="140"/>
+                  </w:tcMar>
+                </w:tcPr>
+                <w:p>
+                  <w:pPr>
+                    <w:spacing w:after="80"/>
+                  </w:pPr>
+                  <w:r>
+                    <w:rPr>
+                      <w:color w:val="1A0F5C"/>
+                      <w:sz w:val="18"/>
+                      <w:szCs w:val="18"/>
+                    </w:rPr>
+                    <w:t xml:space="preserve">Total revenue after the monsoon discount</w:t>
+                  </w:r>
+                </w:p>
+              </w:tc>
+              <w:tc>
+                <w:tcPr>
+                  <w:tcW w:type="dxa" w:w="4763"/>
+                  <w:tcBorders>
+                    <w:top w:val="single" w:color="CFC9EE" w:sz="6"/>
+                    <w:left w:val="single" w:color="CFC9EE" w:sz="6"/>
+                    <w:bottom w:val="single" w:color="CFC9EE" w:sz="6"/>
+                    <w:right w:val="single" w:color="CFC9EE" w:sz="6"/>
+                  </w:tcBorders>
+                  <w:tcMar>
+                    <w:top w:type="dxa" w:w="90"/>
+                    <w:left w:type="dxa" w:w="140"/>
+                    <w:bottom w:type="dxa" w:w="90"/>
+                    <w:right w:type="dxa" w:w="140"/>
+                  </w:tcMar>
+                </w:tcPr>
+                <w:p>
+                  <w:pPr>
+                    <w:spacing w:after="80"/>
+                  </w:pPr>
+                  <w:r>
+                    <w:rPr>
+                      <w:b w:val="false"/>
+                      <w:bCs w:val="false"/>
+                      <w:color w:val="1A0F5C"/>
+                      <w:sz w:val="18"/>
+                      <w:szCs w:val="18"/>
+                    </w:rPr>
+                    <w:t xml:space="preserve">Rose 6 percent</w:t>
+                  </w:r>
+                </w:p>
+              </w:tc>
+            </w:tr>
+            <w:tr>
+              <w:tc>
+                <w:tcPr>
+                  <w:tcW w:type="dxa" w:w="4763"/>
+                  <w:tcBorders>
+                    <w:top w:val="single" w:color="CFC9EE" w:sz="6"/>
+                    <w:left w:val="single" w:color="CFC9EE" w:sz="6"/>
+                    <w:bottom w:val="single" w:color="CFC9EE" w:sz="6"/>
+                    <w:right w:val="single" w:color="CFC9EE" w:sz="6"/>
+                  </w:tcBorders>
+                  <w:shd w:fill="F4F2FA" w:color="auto" w:val="clear"/>
+                  <w:tcMar>
+                    <w:top w:type="dxa" w:w="90"/>
+                    <w:left w:type="dxa" w:w="140"/>
+                    <w:bottom w:type="dxa" w:w="90"/>
+                    <w:right w:type="dxa" w:w="140"/>
+                  </w:tcMar>
+                </w:tcPr>
+                <w:p>
+                  <w:pPr>
+                    <w:spacing w:after="80"/>
+                  </w:pPr>
+                  <w:r>
+                    <w:rPr>
+                      <w:color w:val="1A0F5C"/>
+                      <w:sz w:val="18"/>
+                      <w:szCs w:val="18"/>
+                    </w:rPr>
+                    <w:t xml:space="preserve">Revenue per customer inside each segment</w:t>
+                  </w:r>
+                </w:p>
+              </w:tc>
+              <w:tc>
+                <w:tcPr>
+                  <w:tcW w:type="dxa" w:w="4763"/>
+                  <w:tcBorders>
+                    <w:top w:val="single" w:color="CFC9EE" w:sz="6"/>
+                    <w:left w:val="single" w:color="CFC9EE" w:sz="6"/>
+                    <w:bottom w:val="single" w:color="CFC9EE" w:sz="6"/>
+                    <w:right w:val="single" w:color="CFC9EE" w:sz="6"/>
+                  </w:tcBorders>
+                  <w:shd w:fill="F4F2FA" w:color="auto" w:val="clear"/>
+                  <w:tcMar>
+                    <w:top w:type="dxa" w:w="90"/>
+                    <w:left w:type="dxa" w:w="140"/>
+                    <w:bottom w:type="dxa" w:w="90"/>
+                    <w:right w:type="dxa" w:w="140"/>
+                  </w:tcMar>
+                </w:tcPr>
+                <w:p>
+                  <w:pPr>
+                    <w:spacing w:after="80"/>
+                  </w:pPr>
+                  <w:r>
+                    <w:rPr>
+                      <w:b w:val="false"/>
+                      <w:bCs w:val="false"/>
+                      <w:color w:val="1A0F5C"/>
+                      <w:sz w:val="18"/>
+                      <w:szCs w:val="18"/>
+                    </w:rPr>
+                    <w:t xml:space="preserve">Fell in every segment</w:t>
+                  </w:r>
+                </w:p>
+              </w:tc>
+            </w:tr>
+            <w:tr>
+              <w:tc>
+                <w:tcPr>
+                  <w:tcW w:type="dxa" w:w="4763"/>
+                  <w:tcBorders>
+                    <w:top w:val="single" w:color="CFC9EE" w:sz="6"/>
+                    <w:left w:val="single" w:color="CFC9EE" w:sz="6"/>
+                    <w:bottom w:val="single" w:color="CFC9EE" w:sz="6"/>
+                    <w:right w:val="single" w:color="CFC9EE" w:sz="6"/>
+                  </w:tcBorders>
+                  <w:tcMar>
+                    <w:top w:type="dxa" w:w="90"/>
+                    <w:left w:type="dxa" w:w="140"/>
+                    <w:bottom w:type="dxa" w:w="90"/>
+                    <w:right w:type="dxa" w:w="140"/>
+                  </w:tcMar>
+                </w:tcPr>
+                <w:p>
+                  <w:pPr>
+                    <w:spacing w:after="80"/>
+                  </w:pPr>
+                  <w:r>
+                    <w:rPr>
+                      <w:color w:val="1A0F5C"/>
+                      <w:sz w:val="18"/>
+                      <w:szCs w:val="18"/>
+                    </w:rPr>
+                    <w:t xml:space="preserve">Customers who received the discount</w:t>
+                  </w:r>
+                </w:p>
+              </w:tc>
+              <w:tc>
+                <w:tcPr>
+                  <w:tcW w:type="dxa" w:w="4763"/>
+                  <w:tcBorders>
+                    <w:top w:val="single" w:color="CFC9EE" w:sz="6"/>
+                    <w:left w:val="single" w:color="CFC9EE" w:sz="6"/>
+                    <w:bottom w:val="single" w:color="CFC9EE" w:sz="6"/>
+                    <w:right w:val="single" w:color="CFC9EE" w:sz="6"/>
+                  </w:tcBorders>
+                  <w:tcMar>
+                    <w:top w:type="dxa" w:w="90"/>
+                    <w:left w:type="dxa" w:w="140"/>
+                    <w:bottom w:type="dxa" w:w="90"/>
+                    <w:right w:type="dxa" w:w="140"/>
+                  </w:tcMar>
+                </w:tcPr>
+                <w:p>
+                  <w:pPr>
+                    <w:spacing w:after="80"/>
+                  </w:pPr>
+                  <w:r>
+                    <w:rPr>
+                      <w:b w:val="false"/>
+                      <w:bCs w:val="false"/>
+                      <w:color w:val="1A0F5C"/>
+                      <w:sz w:val="18"/>
+                      <w:szCs w:val="18"/>
+                    </w:rPr>
+                    <w:t xml:space="preserve">Bought more often on average than those who did not</w:t>
+                  </w:r>
+                </w:p>
+              </w:tc>
+            </w:tr>
+          </w:tbl>
+          <w:p>
+            <w:pPr>
+              <w:spacing w:after="80"/>
+              <w:jc w:val="center"/>
+            </w:pPr>
+            <w:r>
+              <w:rPr>
+                <w:i/>
+                <w:iCs/>
+                <w:color w:val="6B6690"/>
+                <w:sz w:val="18"/>
+                <w:szCs w:val="18"/>
+              </w:rPr>
+              <w:t xml:space="preserve">The monsoon discount, as the situation reports it.</w:t>
+            </w:r>
+          </w:p>
         </w:tc>
       </w:tr>
     </w:tbl>
@@ -8085,6 +9179,1254 @@
                 <w:szCs w:val="21"/>
               </w:rPr>
               <w:t xml:space="preserve">Do not repeat it as designed: no segment improved, and the lift is a mix effect.</w:t>
+            </w:r>
+          </w:p>
+        </w:tc>
+      </w:tr>
+    </w:tbl>
+    <w:p>
+      <w:pPr>
+        <w:spacing w:after="100"/>
+      </w:pPr>
+    </w:p>
+    <w:tbl>
+      <w:tblPr>
+        <w:tblW w:type="dxa" w:w="9806"/>
+        <w:tblBorders>
+          <w:top w:val="single" w:color="auto" w:sz="4"/>
+          <w:left w:val="single" w:color="auto" w:sz="4"/>
+          <w:bottom w:val="single" w:color="auto" w:sz="4"/>
+          <w:right w:val="single" w:color="auto" w:sz="4"/>
+          <w:insideH w:val="single" w:color="auto" w:sz="4"/>
+          <w:insideV w:val="single" w:color="auto" w:sz="4"/>
+        </w:tblBorders>
+      </w:tblPr>
+      <w:tblGrid>
+        <w:gridCol w:w="9806"/>
+      </w:tblGrid>
+      <w:tr>
+        <w:trPr>
+          <w:cantSplit/>
+        </w:trPr>
+        <w:tc>
+          <w:tcPr>
+            <w:tcW w:type="dxa" w:w="9806"/>
+            <w:tcBorders>
+              <w:top w:val="single" w:color="5B3FD6" w:sz="6"/>
+              <w:left w:val="single" w:color="5B3FD6" w:sz="6"/>
+              <w:bottom w:val="single" w:color="5B3FD6" w:sz="6"/>
+              <w:right w:val="single" w:color="5B3FD6" w:sz="6"/>
+            </w:tcBorders>
+            <w:shd w:fill="F4F2FA" w:color="auto" w:val="clear"/>
+            <w:tcMar>
+              <w:top w:type="dxa" w:w="90"/>
+              <w:left w:type="dxa" w:w="140"/>
+              <w:bottom w:type="dxa" w:w="90"/>
+              <w:right w:type="dxa" w:w="140"/>
+            </w:tcMar>
+          </w:tcPr>
+          <w:p>
+            <w:pPr>
+              <w:spacing w:after="80"/>
+            </w:pPr>
+            <w:r>
+              <w:rPr>
+                <w:b/>
+                <w:bCs/>
+                <w:color w:val="5B3FD6"/>
+                <w:sz w:val="22"/>
+                <w:szCs w:val="22"/>
+              </w:rPr>
+              <w:t xml:space="preserve">Set 4.  Situation</w:t>
+            </w:r>
+          </w:p>
+          <w:p>
+            <w:pPr>
+              <w:spacing w:after="80"/>
+            </w:pPr>
+            <w:r>
+              <w:rPr>
+                <w:color w:val="1A0F5C"/>
+                <w:sz w:val="21"/>
+                <w:szCs w:val="21"/>
+              </w:rPr>
+              <w:t xml:space="preserve">Kalpa's April export for two segments holds 500 order rows placed by 250 distinct customers. Retail: 400 orders, revenue Rs 8.0 lakh. Business: 100 orders, revenue Rs 12.0 lakh. A slide built from the export reads: orders per customer 1.00, average order value Rs 7,000.</w:t>
+            </w:r>
+          </w:p>
+          <w:tbl>
+            <w:tblPr>
+              <w:tblW w:type="dxa" w:w="9525"/>
+              <w:tblBorders>
+                <w:top w:val="single" w:color="auto" w:sz="4"/>
+                <w:left w:val="single" w:color="auto" w:sz="4"/>
+                <w:bottom w:val="single" w:color="auto" w:sz="4"/>
+                <w:right w:val="single" w:color="auto" w:sz="4"/>
+                <w:insideH w:val="single" w:color="auto" w:sz="4"/>
+                <w:insideV w:val="single" w:color="auto" w:sz="4"/>
+              </w:tblBorders>
+            </w:tblPr>
+            <w:tblGrid>
+              <w:gridCol w:w="3175"/>
+              <w:gridCol w:w="3175"/>
+              <w:gridCol w:w="3175"/>
+            </w:tblGrid>
+            <w:tr>
+              <w:trPr>
+                <w:tblHeader/>
+              </w:trPr>
+              <w:tc>
+                <w:tcPr>
+                  <w:tcW w:type="dxa" w:w="3175"/>
+                  <w:tcBorders>
+                    <w:top w:val="single" w:color="1A0F5C" w:sz="6"/>
+                    <w:left w:val="single" w:color="1A0F5C" w:sz="6"/>
+                    <w:bottom w:val="single" w:color="1A0F5C" w:sz="6"/>
+                    <w:right w:val="single" w:color="1A0F5C" w:sz="6"/>
+                  </w:tcBorders>
+                  <w:shd w:fill="1A0F5C" w:color="auto" w:val="clear"/>
+                  <w:tcMar>
+                    <w:top w:type="dxa" w:w="90"/>
+                    <w:left w:type="dxa" w:w="140"/>
+                    <w:bottom w:type="dxa" w:w="90"/>
+                    <w:right w:type="dxa" w:w="140"/>
+                  </w:tcMar>
+                </w:tcPr>
+                <w:p>
+                  <w:pPr>
+                    <w:spacing w:after="80"/>
+                  </w:pPr>
+                  <w:r>
+                    <w:rPr>
+                      <w:b/>
+                      <w:bCs/>
+                      <w:color w:val="FFFFFF"/>
+                      <w:sz w:val="18"/>
+                      <w:szCs w:val="18"/>
+                    </w:rPr>
+                    <w:t xml:space="preserve">Segment</w:t>
+                  </w:r>
+                </w:p>
+              </w:tc>
+              <w:tc>
+                <w:tcPr>
+                  <w:tcW w:type="dxa" w:w="3175"/>
+                  <w:tcBorders>
+                    <w:top w:val="single" w:color="1A0F5C" w:sz="6"/>
+                    <w:left w:val="single" w:color="1A0F5C" w:sz="6"/>
+                    <w:bottom w:val="single" w:color="1A0F5C" w:sz="6"/>
+                    <w:right w:val="single" w:color="1A0F5C" w:sz="6"/>
+                  </w:tcBorders>
+                  <w:shd w:fill="1A0F5C" w:color="auto" w:val="clear"/>
+                  <w:tcMar>
+                    <w:top w:type="dxa" w:w="90"/>
+                    <w:left w:type="dxa" w:w="140"/>
+                    <w:bottom w:type="dxa" w:w="90"/>
+                    <w:right w:type="dxa" w:w="140"/>
+                  </w:tcMar>
+                </w:tcPr>
+                <w:p>
+                  <w:pPr>
+                    <w:spacing w:after="80"/>
+                  </w:pPr>
+                  <w:r>
+                    <w:rPr>
+                      <w:b/>
+                      <w:bCs/>
+                      <w:color w:val="FFFFFF"/>
+                      <w:sz w:val="18"/>
+                      <w:szCs w:val="18"/>
+                    </w:rPr>
+                    <w:t xml:space="preserve">Order rows</w:t>
+                  </w:r>
+                </w:p>
+              </w:tc>
+              <w:tc>
+                <w:tcPr>
+                  <w:tcW w:type="dxa" w:w="3175"/>
+                  <w:tcBorders>
+                    <w:top w:val="single" w:color="1A0F5C" w:sz="6"/>
+                    <w:left w:val="single" w:color="1A0F5C" w:sz="6"/>
+                    <w:bottom w:val="single" w:color="1A0F5C" w:sz="6"/>
+                    <w:right w:val="single" w:color="1A0F5C" w:sz="6"/>
+                  </w:tcBorders>
+                  <w:shd w:fill="1A0F5C" w:color="auto" w:val="clear"/>
+                  <w:tcMar>
+                    <w:top w:type="dxa" w:w="90"/>
+                    <w:left w:type="dxa" w:w="140"/>
+                    <w:bottom w:type="dxa" w:w="90"/>
+                    <w:right w:type="dxa" w:w="140"/>
+                  </w:tcMar>
+                </w:tcPr>
+                <w:p>
+                  <w:pPr>
+                    <w:spacing w:after="80"/>
+                  </w:pPr>
+                  <w:r>
+                    <w:rPr>
+                      <w:b/>
+                      <w:bCs/>
+                      <w:color w:val="FFFFFF"/>
+                      <w:sz w:val="18"/>
+                      <w:szCs w:val="18"/>
+                    </w:rPr>
+                    <w:t xml:space="preserve">Revenue</w:t>
+                  </w:r>
+                </w:p>
+              </w:tc>
+            </w:tr>
+            <w:tr>
+              <w:tc>
+                <w:tcPr>
+                  <w:tcW w:type="dxa" w:w="3175"/>
+                  <w:tcBorders>
+                    <w:top w:val="single" w:color="CFC9EE" w:sz="6"/>
+                    <w:left w:val="single" w:color="CFC9EE" w:sz="6"/>
+                    <w:bottom w:val="single" w:color="CFC9EE" w:sz="6"/>
+                    <w:right w:val="single" w:color="CFC9EE" w:sz="6"/>
+                  </w:tcBorders>
+                  <w:tcMar>
+                    <w:top w:type="dxa" w:w="90"/>
+                    <w:left w:type="dxa" w:w="140"/>
+                    <w:bottom w:type="dxa" w:w="90"/>
+                    <w:right w:type="dxa" w:w="140"/>
+                  </w:tcMar>
+                </w:tcPr>
+                <w:p>
+                  <w:pPr>
+                    <w:spacing w:after="80"/>
+                  </w:pPr>
+                  <w:r>
+                    <w:rPr>
+                      <w:color w:val="1A0F5C"/>
+                      <w:sz w:val="18"/>
+                      <w:szCs w:val="18"/>
+                    </w:rPr>
+                    <w:t xml:space="preserve">Retail</w:t>
+                  </w:r>
+                </w:p>
+              </w:tc>
+              <w:tc>
+                <w:tcPr>
+                  <w:tcW w:type="dxa" w:w="3175"/>
+                  <w:tcBorders>
+                    <w:top w:val="single" w:color="CFC9EE" w:sz="6"/>
+                    <w:left w:val="single" w:color="CFC9EE" w:sz="6"/>
+                    <w:bottom w:val="single" w:color="CFC9EE" w:sz="6"/>
+                    <w:right w:val="single" w:color="CFC9EE" w:sz="6"/>
+                  </w:tcBorders>
+                  <w:tcMar>
+                    <w:top w:type="dxa" w:w="90"/>
+                    <w:left w:type="dxa" w:w="140"/>
+                    <w:bottom w:type="dxa" w:w="90"/>
+                    <w:right w:type="dxa" w:w="140"/>
+                  </w:tcMar>
+                </w:tcPr>
+                <w:p>
+                  <w:pPr>
+                    <w:spacing w:after="80"/>
+                  </w:pPr>
+                  <w:r>
+                    <w:rPr>
+                      <w:b w:val="false"/>
+                      <w:bCs w:val="false"/>
+                      <w:color w:val="1A0F5C"/>
+                      <w:sz w:val="18"/>
+                      <w:szCs w:val="18"/>
+                    </w:rPr>
+                    <w:t xml:space="preserve">400</w:t>
+                  </w:r>
+                </w:p>
+              </w:tc>
+              <w:tc>
+                <w:tcPr>
+                  <w:tcW w:type="dxa" w:w="3175"/>
+                  <w:tcBorders>
+                    <w:top w:val="single" w:color="CFC9EE" w:sz="6"/>
+                    <w:left w:val="single" w:color="CFC9EE" w:sz="6"/>
+                    <w:bottom w:val="single" w:color="CFC9EE" w:sz="6"/>
+                    <w:right w:val="single" w:color="CFC9EE" w:sz="6"/>
+                  </w:tcBorders>
+                  <w:tcMar>
+                    <w:top w:type="dxa" w:w="90"/>
+                    <w:left w:type="dxa" w:w="140"/>
+                    <w:bottom w:type="dxa" w:w="90"/>
+                    <w:right w:type="dxa" w:w="140"/>
+                  </w:tcMar>
+                </w:tcPr>
+                <w:p>
+                  <w:pPr>
+                    <w:spacing w:after="80"/>
+                  </w:pPr>
+                  <w:r>
+                    <w:rPr>
+                      <w:b w:val="false"/>
+                      <w:bCs w:val="false"/>
+                      <w:color w:val="1A0F5C"/>
+                      <w:sz w:val="18"/>
+                      <w:szCs w:val="18"/>
+                    </w:rPr>
+                    <w:t xml:space="preserve">Rs 8.0 lakh</w:t>
+                  </w:r>
+                </w:p>
+              </w:tc>
+            </w:tr>
+            <w:tr>
+              <w:tc>
+                <w:tcPr>
+                  <w:tcW w:type="dxa" w:w="3175"/>
+                  <w:tcBorders>
+                    <w:top w:val="single" w:color="CFC9EE" w:sz="6"/>
+                    <w:left w:val="single" w:color="CFC9EE" w:sz="6"/>
+                    <w:bottom w:val="single" w:color="CFC9EE" w:sz="6"/>
+                    <w:right w:val="single" w:color="CFC9EE" w:sz="6"/>
+                  </w:tcBorders>
+                  <w:shd w:fill="F4F2FA" w:color="auto" w:val="clear"/>
+                  <w:tcMar>
+                    <w:top w:type="dxa" w:w="90"/>
+                    <w:left w:type="dxa" w:w="140"/>
+                    <w:bottom w:type="dxa" w:w="90"/>
+                    <w:right w:type="dxa" w:w="140"/>
+                  </w:tcMar>
+                </w:tcPr>
+                <w:p>
+                  <w:pPr>
+                    <w:spacing w:after="80"/>
+                  </w:pPr>
+                  <w:r>
+                    <w:rPr>
+                      <w:color w:val="1A0F5C"/>
+                      <w:sz w:val="18"/>
+                      <w:szCs w:val="18"/>
+                    </w:rPr>
+                    <w:t xml:space="preserve">Business</w:t>
+                  </w:r>
+                </w:p>
+              </w:tc>
+              <w:tc>
+                <w:tcPr>
+                  <w:tcW w:type="dxa" w:w="3175"/>
+                  <w:tcBorders>
+                    <w:top w:val="single" w:color="CFC9EE" w:sz="6"/>
+                    <w:left w:val="single" w:color="CFC9EE" w:sz="6"/>
+                    <w:bottom w:val="single" w:color="CFC9EE" w:sz="6"/>
+                    <w:right w:val="single" w:color="CFC9EE" w:sz="6"/>
+                  </w:tcBorders>
+                  <w:shd w:fill="F4F2FA" w:color="auto" w:val="clear"/>
+                  <w:tcMar>
+                    <w:top w:type="dxa" w:w="90"/>
+                    <w:left w:type="dxa" w:w="140"/>
+                    <w:bottom w:type="dxa" w:w="90"/>
+                    <w:right w:type="dxa" w:w="140"/>
+                  </w:tcMar>
+                </w:tcPr>
+                <w:p>
+                  <w:pPr>
+                    <w:spacing w:after="80"/>
+                  </w:pPr>
+                  <w:r>
+                    <w:rPr>
+                      <w:b w:val="false"/>
+                      <w:bCs w:val="false"/>
+                      <w:color w:val="1A0F5C"/>
+                      <w:sz w:val="18"/>
+                      <w:szCs w:val="18"/>
+                    </w:rPr>
+                    <w:t xml:space="preserve">100</w:t>
+                  </w:r>
+                </w:p>
+              </w:tc>
+              <w:tc>
+                <w:tcPr>
+                  <w:tcW w:type="dxa" w:w="3175"/>
+                  <w:tcBorders>
+                    <w:top w:val="single" w:color="CFC9EE" w:sz="6"/>
+                    <w:left w:val="single" w:color="CFC9EE" w:sz="6"/>
+                    <w:bottom w:val="single" w:color="CFC9EE" w:sz="6"/>
+                    <w:right w:val="single" w:color="CFC9EE" w:sz="6"/>
+                  </w:tcBorders>
+                  <w:shd w:fill="F4F2FA" w:color="auto" w:val="clear"/>
+                  <w:tcMar>
+                    <w:top w:type="dxa" w:w="90"/>
+                    <w:left w:type="dxa" w:w="140"/>
+                    <w:bottom w:type="dxa" w:w="90"/>
+                    <w:right w:type="dxa" w:w="140"/>
+                  </w:tcMar>
+                </w:tcPr>
+                <w:p>
+                  <w:pPr>
+                    <w:spacing w:after="80"/>
+                  </w:pPr>
+                  <w:r>
+                    <w:rPr>
+                      <w:b w:val="false"/>
+                      <w:bCs w:val="false"/>
+                      <w:color w:val="1A0F5C"/>
+                      <w:sz w:val="18"/>
+                      <w:szCs w:val="18"/>
+                    </w:rPr>
+                    <w:t xml:space="preserve">Rs 12.0 lakh</w:t>
+                  </w:r>
+                </w:p>
+              </w:tc>
+            </w:tr>
+          </w:tbl>
+          <w:p>
+            <w:pPr>
+              <w:spacing w:after="80"/>
+              <w:jc w:val="center"/>
+            </w:pPr>
+            <w:r>
+              <w:rPr>
+                <w:i/>
+                <w:iCs/>
+                <w:color w:val="6B6690"/>
+                <w:sz w:val="18"/>
+                <w:szCs w:val="18"/>
+              </w:rPr>
+              <w:t xml:space="preserve">April, two segments. The 500 order rows come from 250 distinct customers.</w:t>
+            </w:r>
+          </w:p>
+        </w:tc>
+      </w:tr>
+    </w:tbl>
+    <w:p>
+      <w:pPr>
+        <w:spacing w:after="100"/>
+      </w:pPr>
+    </w:p>
+    <w:tbl>
+      <w:tblPr>
+        <w:tblW w:type="dxa" w:w="9806"/>
+        <w:tblBorders>
+          <w:top w:val="single" w:color="auto" w:sz="4"/>
+          <w:left w:val="single" w:color="auto" w:sz="4"/>
+          <w:bottom w:val="single" w:color="auto" w:sz="4"/>
+          <w:right w:val="single" w:color="auto" w:sz="4"/>
+          <w:insideH w:val="single" w:color="auto" w:sz="4"/>
+          <w:insideV w:val="single" w:color="auto" w:sz="4"/>
+        </w:tblBorders>
+      </w:tblPr>
+      <w:tblGrid>
+        <w:gridCol w:w="9806"/>
+      </w:tblGrid>
+      <w:tr>
+        <w:trPr>
+          <w:cantSplit/>
+        </w:trPr>
+        <w:tc>
+          <w:tcPr>
+            <w:tcW w:type="dxa" w:w="9806"/>
+            <w:tcBorders>
+              <w:top w:val="single" w:color="CFC9EE" w:sz="6"/>
+              <w:left w:val="single" w:color="CFC9EE" w:sz="6"/>
+              <w:bottom w:val="single" w:color="CFC9EE" w:sz="6"/>
+              <w:right w:val="single" w:color="CFC9EE" w:sz="6"/>
+            </w:tcBorders>
+            <w:tcMar>
+              <w:top w:type="dxa" w:w="90"/>
+              <w:left w:type="dxa" w:w="140"/>
+              <w:bottom w:type="dxa" w:w="90"/>
+              <w:right w:type="dxa" w:w="140"/>
+            </w:tcMar>
+          </w:tcPr>
+          <w:p>
+            <w:pPr>
+              <w:spacing w:after="60"/>
+            </w:pPr>
+            <w:r>
+              <w:rPr>
+                <w:b/>
+                <w:bCs/>
+                <w:color w:val="5B3FD6"/>
+                <w:sz w:val="24"/>
+                <w:szCs w:val="24"/>
+              </w:rPr>
+              <w:t xml:space="preserve">Q46</w:t>
+            </w:r>
+            <w:r>
+              <w:rPr>
+                <w:color w:val="6B6690"/>
+                <w:sz w:val="18"/>
+                <w:szCs w:val="18"/>
+              </w:rPr>
+              <w:t xml:space="preserve">   Scenario set</w:t>
+            </w:r>
+          </w:p>
+          <w:p>
+            <w:pPr>
+              <w:spacing w:after="80"/>
+            </w:pPr>
+            <w:r>
+              <w:rPr>
+                <w:color w:val="1A0F5C"/>
+                <w:sz w:val="21"/>
+                <w:szCs w:val="21"/>
+              </w:rPr>
+              <w:t xml:space="preserve">Orders per customer, divided by the number of distinct customers, is ____.</w:t>
+            </w:r>
+          </w:p>
+          <w:p>
+            <w:pPr>
+              <w:spacing w:before="80"/>
+            </w:pPr>
+            <w:r>
+              <w:rPr>
+                <w:color w:val="6B6690"/>
+                <w:sz w:val="21"/>
+                <w:szCs w:val="21"/>
+              </w:rPr>
+              <w:t xml:space="preserve">Answer:  ______________________________</w:t>
+            </w:r>
+          </w:p>
+        </w:tc>
+      </w:tr>
+    </w:tbl>
+    <w:p>
+      <w:pPr>
+        <w:spacing w:after="100"/>
+      </w:pPr>
+    </w:p>
+    <w:tbl>
+      <w:tblPr>
+        <w:tblW w:type="dxa" w:w="9806"/>
+        <w:tblBorders>
+          <w:top w:val="single" w:color="auto" w:sz="4"/>
+          <w:left w:val="single" w:color="auto" w:sz="4"/>
+          <w:bottom w:val="single" w:color="auto" w:sz="4"/>
+          <w:right w:val="single" w:color="auto" w:sz="4"/>
+          <w:insideH w:val="single" w:color="auto" w:sz="4"/>
+          <w:insideV w:val="single" w:color="auto" w:sz="4"/>
+        </w:tblBorders>
+      </w:tblPr>
+      <w:tblGrid>
+        <w:gridCol w:w="9806"/>
+      </w:tblGrid>
+      <w:tr>
+        <w:trPr>
+          <w:cantSplit/>
+        </w:trPr>
+        <w:tc>
+          <w:tcPr>
+            <w:tcW w:type="dxa" w:w="9806"/>
+            <w:tcBorders>
+              <w:top w:val="single" w:color="CFC9EE" w:sz="6"/>
+              <w:left w:val="single" w:color="CFC9EE" w:sz="6"/>
+              <w:bottom w:val="single" w:color="CFC9EE" w:sz="6"/>
+              <w:right w:val="single" w:color="CFC9EE" w:sz="6"/>
+            </w:tcBorders>
+            <w:tcMar>
+              <w:top w:type="dxa" w:w="90"/>
+              <w:left w:type="dxa" w:w="140"/>
+              <w:bottom w:type="dxa" w:w="90"/>
+              <w:right w:type="dxa" w:w="140"/>
+            </w:tcMar>
+          </w:tcPr>
+          <w:p>
+            <w:pPr>
+              <w:spacing w:after="60"/>
+            </w:pPr>
+            <w:r>
+              <w:rPr>
+                <w:b/>
+                <w:bCs/>
+                <w:color w:val="5B3FD6"/>
+                <w:sz w:val="24"/>
+                <w:szCs w:val="24"/>
+              </w:rPr>
+              <w:t xml:space="preserve">Q47</w:t>
+            </w:r>
+            <w:r>
+              <w:rPr>
+                <w:color w:val="6B6690"/>
+                <w:sz w:val="18"/>
+                <w:szCs w:val="18"/>
+              </w:rPr>
+              <w:t xml:space="preserve">   Scenario set</w:t>
+            </w:r>
+          </w:p>
+          <w:p>
+            <w:pPr>
+              <w:spacing w:after="80"/>
+            </w:pPr>
+            <w:r>
+              <w:rPr>
+                <w:color w:val="1A0F5C"/>
+                <w:sz w:val="21"/>
+                <w:szCs w:val="21"/>
+              </w:rPr>
+              <w:t xml:space="preserve">The average order value across both segments is Rs ____.</w:t>
+            </w:r>
+          </w:p>
+          <w:p>
+            <w:pPr>
+              <w:spacing w:before="80"/>
+            </w:pPr>
+            <w:r>
+              <w:rPr>
+                <w:color w:val="6B6690"/>
+                <w:sz w:val="21"/>
+                <w:szCs w:val="21"/>
+              </w:rPr>
+              <w:t xml:space="preserve">Answer:  ______________________________</w:t>
+            </w:r>
+          </w:p>
+        </w:tc>
+      </w:tr>
+    </w:tbl>
+    <w:p>
+      <w:pPr>
+        <w:spacing w:after="100"/>
+      </w:pPr>
+    </w:p>
+    <w:tbl>
+      <w:tblPr>
+        <w:tblW w:type="dxa" w:w="9806"/>
+        <w:tblBorders>
+          <w:top w:val="single" w:color="auto" w:sz="4"/>
+          <w:left w:val="single" w:color="auto" w:sz="4"/>
+          <w:bottom w:val="single" w:color="auto" w:sz="4"/>
+          <w:right w:val="single" w:color="auto" w:sz="4"/>
+          <w:insideH w:val="single" w:color="auto" w:sz="4"/>
+          <w:insideV w:val="single" w:color="auto" w:sz="4"/>
+        </w:tblBorders>
+      </w:tblPr>
+      <w:tblGrid>
+        <w:gridCol w:w="9806"/>
+      </w:tblGrid>
+      <w:tr>
+        <w:trPr>
+          <w:cantSplit/>
+        </w:trPr>
+        <w:tc>
+          <w:tcPr>
+            <w:tcW w:type="dxa" w:w="9806"/>
+            <w:tcBorders>
+              <w:top w:val="single" w:color="CFC9EE" w:sz="6"/>
+              <w:left w:val="single" w:color="CFC9EE" w:sz="6"/>
+              <w:bottom w:val="single" w:color="CFC9EE" w:sz="6"/>
+              <w:right w:val="single" w:color="CFC9EE" w:sz="6"/>
+            </w:tcBorders>
+            <w:tcMar>
+              <w:top w:type="dxa" w:w="90"/>
+              <w:left w:type="dxa" w:w="140"/>
+              <w:bottom w:type="dxa" w:w="90"/>
+              <w:right w:type="dxa" w:w="140"/>
+            </w:tcMar>
+          </w:tcPr>
+          <w:p>
+            <w:pPr>
+              <w:spacing w:after="60"/>
+            </w:pPr>
+            <w:r>
+              <w:rPr>
+                <w:b/>
+                <w:bCs/>
+                <w:color w:val="5B3FD6"/>
+                <w:sz w:val="24"/>
+                <w:szCs w:val="24"/>
+              </w:rPr>
+              <w:t xml:space="preserve">Q48</w:t>
+            </w:r>
+            <w:r>
+              <w:rPr>
+                <w:color w:val="6B6690"/>
+                <w:sz w:val="18"/>
+                <w:szCs w:val="18"/>
+              </w:rPr>
+              <w:t xml:space="preserve">   Scenario set</w:t>
+            </w:r>
+          </w:p>
+          <w:p>
+            <w:pPr>
+              <w:spacing w:after="80"/>
+            </w:pPr>
+            <w:r>
+              <w:rPr>
+                <w:color w:val="1A0F5C"/>
+                <w:sz w:val="21"/>
+                <w:szCs w:val="21"/>
+              </w:rPr>
+              <w:t xml:space="preserve">Marketing reads the slide as "nobody comes back, so buy new customers". What do you say in the room?</w:t>
+            </w:r>
+          </w:p>
+          <w:p>
+            <w:pPr>
+              <w:spacing w:after="40"/>
+              <w:ind w:left="240"/>
+            </w:pPr>
+            <w:r>
+              <w:rPr>
+                <w:b/>
+                <w:bCs/>
+                <w:color w:val="5B3FD6"/>
+                <w:sz w:val="21"/>
+                <w:szCs w:val="21"/>
+              </w:rPr>
+              <w:t xml:space="preserve">(a)  </w:t>
+            </w:r>
+            <w:r>
+              <w:rPr>
+                <w:color w:val="1A0F5C"/>
+                <w:sz w:val="21"/>
+                <w:szCs w:val="21"/>
+              </w:rPr>
+              <w:t xml:space="preserve">Agree, because the export shows each customer placing exactly one order in April.</w:t>
+            </w:r>
+          </w:p>
+          <w:p>
+            <w:pPr>
+              <w:spacing w:after="40"/>
+              <w:ind w:left="240"/>
+            </w:pPr>
+            <w:r>
+              <w:rPr>
+                <w:b/>
+                <w:bCs/>
+                <w:color w:val="5B3FD6"/>
+                <w:sz w:val="21"/>
+                <w:szCs w:val="21"/>
+              </w:rPr>
+              <w:t xml:space="preserve">(b)  </w:t>
+            </w:r>
+            <w:r>
+              <w:rPr>
+                <w:color w:val="1A0F5C"/>
+                <w:sz w:val="21"/>
+                <w:szCs w:val="21"/>
+              </w:rPr>
+              <w:t xml:space="preserve">Agree, once the median order value has been checked beside the Rs 7,000 mean.</w:t>
+            </w:r>
+          </w:p>
+          <w:p>
+            <w:pPr>
+              <w:spacing w:after="40"/>
+              <w:ind w:left="240"/>
+            </w:pPr>
+            <w:r>
+              <w:rPr>
+                <w:b/>
+                <w:bCs/>
+                <w:color w:val="5B3FD6"/>
+                <w:sz w:val="21"/>
+                <w:szCs w:val="21"/>
+              </w:rPr>
+              <w:t xml:space="preserve">(c)  </w:t>
+            </w:r>
+            <w:r>
+              <w:rPr>
+                <w:color w:val="1A0F5C"/>
+                <w:sz w:val="21"/>
+                <w:szCs w:val="21"/>
+              </w:rPr>
+              <w:t xml:space="preserve">Push back: 250 customers placed 500 orders, so "nobody comes back" is false.</w:t>
+            </w:r>
+          </w:p>
+          <w:p>
+            <w:pPr>
+              <w:spacing w:after="40"/>
+              <w:ind w:left="240"/>
+            </w:pPr>
+            <w:r>
+              <w:rPr>
+                <w:b/>
+                <w:bCs/>
+                <w:color w:val="5B3FD6"/>
+                <w:sz w:val="21"/>
+                <w:szCs w:val="21"/>
+              </w:rPr>
+              <w:t xml:space="preserve">(d)  </w:t>
+            </w:r>
+            <w:r>
+              <w:rPr>
+                <w:color w:val="1A0F5C"/>
+                <w:sz w:val="21"/>
+                <w:szCs w:val="21"/>
+              </w:rPr>
+              <w:t xml:space="preserve">Push back, because the Rs 7,000 average shows customers already spend enough.</w:t>
+            </w:r>
+          </w:p>
+        </w:tc>
+      </w:tr>
+    </w:tbl>
+    <w:p>
+      <w:pPr>
+        <w:spacing w:after="100"/>
+      </w:pPr>
+    </w:p>
+    <w:tbl>
+      <w:tblPr>
+        <w:tblW w:type="dxa" w:w="9806"/>
+        <w:tblBorders>
+          <w:top w:val="single" w:color="auto" w:sz="4"/>
+          <w:left w:val="single" w:color="auto" w:sz="4"/>
+          <w:bottom w:val="single" w:color="auto" w:sz="4"/>
+          <w:right w:val="single" w:color="auto" w:sz="4"/>
+          <w:insideH w:val="single" w:color="auto" w:sz="4"/>
+          <w:insideV w:val="single" w:color="auto" w:sz="4"/>
+        </w:tblBorders>
+      </w:tblPr>
+      <w:tblGrid>
+        <w:gridCol w:w="9806"/>
+      </w:tblGrid>
+      <w:tr>
+        <w:trPr>
+          <w:cantSplit/>
+        </w:trPr>
+        <w:tc>
+          <w:tcPr>
+            <w:tcW w:type="dxa" w:w="9806"/>
+            <w:tcBorders>
+              <w:top w:val="single" w:color="5B3FD6" w:sz="6"/>
+              <w:left w:val="single" w:color="5B3FD6" w:sz="6"/>
+              <w:bottom w:val="single" w:color="5B3FD6" w:sz="6"/>
+              <w:right w:val="single" w:color="5B3FD6" w:sz="6"/>
+            </w:tcBorders>
+            <w:shd w:fill="F4F2FA" w:color="auto" w:val="clear"/>
+            <w:tcMar>
+              <w:top w:type="dxa" w:w="90"/>
+              <w:left w:type="dxa" w:w="140"/>
+              <w:bottom w:type="dxa" w:w="90"/>
+              <w:right w:type="dxa" w:w="140"/>
+            </w:tcMar>
+          </w:tcPr>
+          <w:p>
+            <w:pPr>
+              <w:spacing w:after="80"/>
+            </w:pPr>
+            <w:r>
+              <w:rPr>
+                <w:b/>
+                <w:bCs/>
+                <w:color w:val="5B3FD6"/>
+                <w:sz w:val="22"/>
+                <w:szCs w:val="22"/>
+              </w:rPr>
+              <w:t xml:space="preserve">Set 5.  Situation</w:t>
+            </w:r>
+          </w:p>
+          <w:p>
+            <w:pPr>
+              <w:spacing w:after="80"/>
+            </w:pPr>
+            <w:r>
+              <w:rPr>
+                <w:color w:val="1A0F5C"/>
+                <w:sz w:val="21"/>
+                <w:szCs w:val="21"/>
+              </w:rPr>
+              <w:t xml:space="preserve">Kalpa's store-channel export for Q1 holds 1,200 rows worth Rs 96.0 lakh. A dedupe that compares whole records reports 0 duplicates. A second pass keyed on order_id finds 40 rows whose order_id already appeared, each differing from the first row only in its timestamp. The run keeps 1,160 clean rows worth Rs 88.0 lakh and logs the 40 repeats as rejects worth Rs 5.0 lakh.</w:t>
+            </w:r>
+          </w:p>
+          <w:p>
+            <w:pPr>
+              <w:spacing w:after="60" w:before="60"/>
+              <w:jc w:val="center"/>
+            </w:pPr>
+            <w:r>
+              <w:drawing>
+                <wp:inline distT="0" distB="0" distL="0" distR="0">
+                  <wp:extent cx="5810250" cy="3295650"/>
+                  <wp:effectExtent t="0" r="0" b="0" l="0"/>
+                  <wp:docPr id="1" name="" descr="" title=""/>
+                  <wp:cNvGraphicFramePr>
+                    <a:graphicFrameLocks xmlns:a="http://schemas.openxmlformats.org/drawingml/2006/main" noChangeAspect="1"/>
+                  </wp:cNvGraphicFramePr>
+                  <a:graphic xmlns:a="http://schemas.openxmlformats.org/drawingml/2006/main">
+                    <a:graphicData uri="http://schemas.openxmlformats.org/drawingml/2006/picture">
+                      <pic:pic xmlns:pic="http://schemas.openxmlformats.org/drawingml/2006/picture">
+                        <pic:nvPicPr>
+                          <pic:cNvPr id="0" name="" descr=""/>
+                          <pic:cNvPicPr>
+                            <a:picLocks noChangeAspect="1" noChangeArrowheads="1"/>
+                          </pic:cNvPicPr>
+                        </pic:nvPicPr>
+                        <pic:blipFill>
+                          <a:blip r:embed="rId9" cstate="none"/>
+                          <a:srcRect/>
+                          <a:stretch>
+                            <a:fillRect/>
+                          </a:stretch>
+                        </pic:blipFill>
+                        <pic:spPr bwMode="auto">
+                          <a:xfrm>
+                            <a:off x="0" y="0"/>
+                            <a:ext cx="5810250" cy="3295650"/>
+                          </a:xfrm>
+                          <a:prstGeom prst="rect">
+                            <a:avLst/>
+                          </a:prstGeom>
+                        </pic:spPr>
+                      </pic:pic>
+                    </a:graphicData>
+                  </a:graphic>
+                </wp:inline>
+              </w:drawing>
+            </w:r>
+          </w:p>
+          <w:p>
+            <w:pPr>
+              <w:spacing w:after="80"/>
+              <w:jc w:val="center"/>
+            </w:pPr>
+            <w:r>
+              <w:rPr>
+                <w:i/>
+                <w:iCs/>
+                <w:color w:val="6B6690"/>
+                <w:sz w:val="18"/>
+                <w:szCs w:val="18"/>
+              </w:rPr>
+              <w:t xml:space="preserve">The cleaning run on the store export, with the rows and the rupees at each stage.</w:t>
+            </w:r>
+          </w:p>
+        </w:tc>
+      </w:tr>
+    </w:tbl>
+    <w:p>
+      <w:pPr>
+        <w:spacing w:after="100"/>
+      </w:pPr>
+    </w:p>
+    <w:tbl>
+      <w:tblPr>
+        <w:tblW w:type="dxa" w:w="9806"/>
+        <w:tblBorders>
+          <w:top w:val="single" w:color="auto" w:sz="4"/>
+          <w:left w:val="single" w:color="auto" w:sz="4"/>
+          <w:bottom w:val="single" w:color="auto" w:sz="4"/>
+          <w:right w:val="single" w:color="auto" w:sz="4"/>
+          <w:insideH w:val="single" w:color="auto" w:sz="4"/>
+          <w:insideV w:val="single" w:color="auto" w:sz="4"/>
+        </w:tblBorders>
+      </w:tblPr>
+      <w:tblGrid>
+        <w:gridCol w:w="9806"/>
+      </w:tblGrid>
+      <w:tr>
+        <w:trPr>
+          <w:cantSplit/>
+        </w:trPr>
+        <w:tc>
+          <w:tcPr>
+            <w:tcW w:type="dxa" w:w="9806"/>
+            <w:tcBorders>
+              <w:top w:val="single" w:color="CFC9EE" w:sz="6"/>
+              <w:left w:val="single" w:color="CFC9EE" w:sz="6"/>
+              <w:bottom w:val="single" w:color="CFC9EE" w:sz="6"/>
+              <w:right w:val="single" w:color="CFC9EE" w:sz="6"/>
+            </w:tcBorders>
+            <w:tcMar>
+              <w:top w:type="dxa" w:w="90"/>
+              <w:left w:type="dxa" w:w="140"/>
+              <w:bottom w:type="dxa" w:w="90"/>
+              <w:right w:type="dxa" w:w="140"/>
+            </w:tcMar>
+          </w:tcPr>
+          <w:p>
+            <w:pPr>
+              <w:spacing w:after="60"/>
+            </w:pPr>
+            <w:r>
+              <w:rPr>
+                <w:b/>
+                <w:bCs/>
+                <w:color w:val="5B3FD6"/>
+                <w:sz w:val="24"/>
+                <w:szCs w:val="24"/>
+              </w:rPr>
+              <w:t xml:space="preserve">Q49</w:t>
+            </w:r>
+            <w:r>
+              <w:rPr>
+                <w:color w:val="6B6690"/>
+                <w:sz w:val="18"/>
+                <w:szCs w:val="18"/>
+              </w:rPr>
+              <w:t xml:space="preserve">   Scenario set</w:t>
+            </w:r>
+          </w:p>
+          <w:p>
+            <w:pPr>
+              <w:spacing w:after="80"/>
+            </w:pPr>
+            <w:r>
+              <w:rPr>
+                <w:color w:val="1A0F5C"/>
+                <w:sz w:val="21"/>
+                <w:szCs w:val="21"/>
+              </w:rPr>
+              <w:t xml:space="preserve">Which duplicate count should the run trust?</w:t>
+            </w:r>
+          </w:p>
+          <w:p>
+            <w:pPr>
+              <w:spacing w:after="40"/>
+              <w:ind w:left="240"/>
+            </w:pPr>
+            <w:r>
+              <w:rPr>
+                <w:b/>
+                <w:bCs/>
+                <w:color w:val="5B3FD6"/>
+                <w:sz w:val="21"/>
+                <w:szCs w:val="21"/>
+              </w:rPr>
+              <w:t xml:space="preserve">(a)  </w:t>
+            </w:r>
+            <w:r>
+              <w:rPr>
+                <w:color w:val="1A0F5C"/>
+                <w:sz w:val="21"/>
+                <w:szCs w:val="21"/>
+              </w:rPr>
+              <w:t xml:space="preserve">Zero, because a duplicate has to match the earlier row in every field.</w:t>
+            </w:r>
+          </w:p>
+          <w:p>
+            <w:pPr>
+              <w:spacing w:after="40"/>
+              <w:ind w:left="240"/>
+            </w:pPr>
+            <w:r>
+              <w:rPr>
+                <w:b/>
+                <w:bCs/>
+                <w:color w:val="5B3FD6"/>
+                <w:sz w:val="21"/>
+                <w:szCs w:val="21"/>
+              </w:rPr>
+              <w:t xml:space="preserve">(b)  </w:t>
+            </w:r>
+            <w:r>
+              <w:rPr>
+                <w:color w:val="1A0F5C"/>
+                <w:sz w:val="21"/>
+                <w:szCs w:val="21"/>
+              </w:rPr>
+              <w:t xml:space="preserve">Zero, because a different timestamp proves two separate orders were placed.</w:t>
+            </w:r>
+          </w:p>
+          <w:p>
+            <w:pPr>
+              <w:spacing w:after="40"/>
+              <w:ind w:left="240"/>
+            </w:pPr>
+            <w:r>
+              <w:rPr>
+                <w:b/>
+                <w:bCs/>
+                <w:color w:val="5B3FD6"/>
+                <w:sz w:val="21"/>
+                <w:szCs w:val="21"/>
+              </w:rPr>
+              <w:t xml:space="preserve">(c)  </w:t>
+            </w:r>
+            <w:r>
+              <w:rPr>
+                <w:color w:val="1A0F5C"/>
+                <w:sz w:val="21"/>
+                <w:szCs w:val="21"/>
+              </w:rPr>
+              <w:t xml:space="preserve">Forty, but only once Finance has confirmed every pair by hand.</w:t>
+            </w:r>
+          </w:p>
+          <w:p>
+            <w:pPr>
+              <w:spacing w:after="40"/>
+              <w:ind w:left="240"/>
+            </w:pPr>
+            <w:r>
+              <w:rPr>
+                <w:b/>
+                <w:bCs/>
+                <w:color w:val="5B3FD6"/>
+                <w:sz w:val="21"/>
+                <w:szCs w:val="21"/>
+              </w:rPr>
+              <w:t xml:space="preserve">(d)  </w:t>
+            </w:r>
+            <w:r>
+              <w:rPr>
+                <w:color w:val="1A0F5C"/>
+                <w:sz w:val="21"/>
+                <w:szCs w:val="21"/>
+              </w:rPr>
+              <w:t xml:space="preserve">Forty, because the identity rule says one order_id is one order.</w:t>
+            </w:r>
+          </w:p>
+        </w:tc>
+      </w:tr>
+    </w:tbl>
+    <w:p>
+      <w:pPr>
+        <w:spacing w:after="100"/>
+      </w:pPr>
+    </w:p>
+    <w:tbl>
+      <w:tblPr>
+        <w:tblW w:type="dxa" w:w="9806"/>
+        <w:tblBorders>
+          <w:top w:val="single" w:color="auto" w:sz="4"/>
+          <w:left w:val="single" w:color="auto" w:sz="4"/>
+          <w:bottom w:val="single" w:color="auto" w:sz="4"/>
+          <w:right w:val="single" w:color="auto" w:sz="4"/>
+          <w:insideH w:val="single" w:color="auto" w:sz="4"/>
+          <w:insideV w:val="single" w:color="auto" w:sz="4"/>
+        </w:tblBorders>
+      </w:tblPr>
+      <w:tblGrid>
+        <w:gridCol w:w="9806"/>
+      </w:tblGrid>
+      <w:tr>
+        <w:trPr>
+          <w:cantSplit/>
+        </w:trPr>
+        <w:tc>
+          <w:tcPr>
+            <w:tcW w:type="dxa" w:w="9806"/>
+            <w:tcBorders>
+              <w:top w:val="single" w:color="CFC9EE" w:sz="6"/>
+              <w:left w:val="single" w:color="CFC9EE" w:sz="6"/>
+              <w:bottom w:val="single" w:color="CFC9EE" w:sz="6"/>
+              <w:right w:val="single" w:color="CFC9EE" w:sz="6"/>
+            </w:tcBorders>
+            <w:tcMar>
+              <w:top w:type="dxa" w:w="90"/>
+              <w:left w:type="dxa" w:w="140"/>
+              <w:bottom w:type="dxa" w:w="90"/>
+              <w:right w:type="dxa" w:w="140"/>
+            </w:tcMar>
+          </w:tcPr>
+          <w:p>
+            <w:pPr>
+              <w:spacing w:after="60"/>
+            </w:pPr>
+            <w:r>
+              <w:rPr>
+                <w:b/>
+                <w:bCs/>
+                <w:color w:val="5B3FD6"/>
+                <w:sz w:val="24"/>
+                <w:szCs w:val="24"/>
+              </w:rPr>
+              <w:t xml:space="preserve">Q50</w:t>
+            </w:r>
+            <w:r>
+              <w:rPr>
+                <w:color w:val="6B6690"/>
+                <w:sz w:val="18"/>
+                <w:szCs w:val="18"/>
+              </w:rPr>
+              <w:t xml:space="preserve">   Scenario set</w:t>
+            </w:r>
+          </w:p>
+          <w:p>
+            <w:pPr>
+              <w:spacing w:after="80"/>
+            </w:pPr>
+            <w:r>
+              <w:rPr>
+                <w:color w:val="1A0F5C"/>
+                <w:sz w:val="21"/>
+                <w:szCs w:val="21"/>
+              </w:rPr>
+              <w:t xml:space="preserve">The row counts add up: 1,160 clean plus 40 rejected is 1,200. What is the honest status of the run?</w:t>
+            </w:r>
+          </w:p>
+          <w:p>
+            <w:pPr>
+              <w:spacing w:after="40"/>
+              <w:ind w:left="240"/>
+            </w:pPr>
+            <w:r>
+              <w:rPr>
+                <w:b/>
+                <w:bCs/>
+                <w:color w:val="5B3FD6"/>
+                <w:sz w:val="21"/>
+                <w:szCs w:val="21"/>
+              </w:rPr>
+              <w:t xml:space="preserve">(a)  </w:t>
+            </w:r>
+            <w:r>
+              <w:rPr>
+                <w:color w:val="1A0F5C"/>
+                <w:sz w:val="21"/>
+                <w:szCs w:val="21"/>
+              </w:rPr>
+              <w:t xml:space="preserve">Reconciled, because the clean rows and the rejects add back to the 1,200 input rows.</w:t>
+            </w:r>
+          </w:p>
+          <w:p>
+            <w:pPr>
+              <w:spacing w:after="40"/>
+              <w:ind w:left="240"/>
+            </w:pPr>
+            <w:r>
+              <w:rPr>
+                <w:b/>
+                <w:bCs/>
+                <w:color w:val="5B3FD6"/>
+                <w:sz w:val="21"/>
+                <w:szCs w:val="21"/>
+              </w:rPr>
+              <w:t xml:space="preserve">(b)  </w:t>
+            </w:r>
+            <w:r>
+              <w:rPr>
+                <w:color w:val="1A0F5C"/>
+                <w:sz w:val="21"/>
+                <w:szCs w:val="21"/>
+              </w:rPr>
+              <w:t xml:space="preserve">Not reconciled, because Rs 3.0 lakh is in neither the clean file nor the log.</w:t>
+            </w:r>
+          </w:p>
+          <w:p>
+            <w:pPr>
+              <w:spacing w:after="40"/>
+              <w:ind w:left="240"/>
+            </w:pPr>
+            <w:r>
+              <w:rPr>
+                <w:b/>
+                <w:bCs/>
+                <w:color w:val="5B3FD6"/>
+                <w:sz w:val="21"/>
+                <w:szCs w:val="21"/>
+              </w:rPr>
+              <w:t xml:space="preserve">(c)  </w:t>
+            </w:r>
+            <w:r>
+              <w:rPr>
+                <w:color w:val="1A0F5C"/>
+                <w:sz w:val="21"/>
+                <w:szCs w:val="21"/>
+              </w:rPr>
+              <w:t xml:space="preserve">Not reconciled, because Rs 8.0 lakh left the file when the 40 repeats were removed.</w:t>
+            </w:r>
+          </w:p>
+          <w:p>
+            <w:pPr>
+              <w:spacing w:after="40"/>
+              <w:ind w:left="240"/>
+            </w:pPr>
+            <w:r>
+              <w:rPr>
+                <w:b/>
+                <w:bCs/>
+                <w:color w:val="5B3FD6"/>
+                <w:sz w:val="21"/>
+                <w:szCs w:val="21"/>
+              </w:rPr>
+              <w:t xml:space="preserve">(d)  </w:t>
+            </w:r>
+            <w:r>
+              <w:rPr>
+                <w:color w:val="1A0F5C"/>
+                <w:sz w:val="21"/>
+                <w:szCs w:val="21"/>
+              </w:rPr>
+              <w:t xml:space="preserve">Reconciled, because a gap under 5 percent of the input is within ordinary rounding.</w:t>
             </w:r>
           </w:p>
         </w:tc>
@@ -8124,7 +10466,7 @@
           <w:sz w:val="21"/>
           <w:szCs w:val="21"/>
         </w:rPr>
-        <w:t xml:space="preserve">5 items, Q46 to Q50, about 20 minutes. Show the working, then the answer.</w:t>
+        <w:t xml:space="preserve">5 items, Q51 to Q55, about 20 minutes. Show the working, then the answer.</w:t>
       </w:r>
     </w:p>
     <w:tbl>
@@ -8174,7 +10516,7 @@
                 <w:sz w:val="24"/>
                 <w:szCs w:val="24"/>
               </w:rPr>
-              <w:t xml:space="preserve">Q46</w:t>
+              <w:t xml:space="preserve">Q51</w:t>
             </w:r>
             <w:r>
               <w:rPr>
@@ -8279,7 +10621,7 @@
                 <w:sz w:val="24"/>
                 <w:szCs w:val="24"/>
               </w:rPr>
-              <w:t xml:space="preserve">Q47</w:t>
+              <w:t xml:space="preserve">Q52</w:t>
             </w:r>
             <w:r>
               <w:rPr>
@@ -8384,7 +10726,7 @@
                 <w:sz w:val="24"/>
                 <w:szCs w:val="24"/>
               </w:rPr>
-              <w:t xml:space="preserve">Q48</w:t>
+              <w:t xml:space="preserve">Q53</w:t>
             </w:r>
             <w:r>
               <w:rPr>
@@ -8489,7 +10831,7 @@
                 <w:sz w:val="24"/>
                 <w:szCs w:val="24"/>
               </w:rPr>
-              <w:t xml:space="preserve">Q49</w:t>
+              <w:t xml:space="preserve">Q54</w:t>
             </w:r>
             <w:r>
               <w:rPr>
@@ -8594,7 +10936,7 @@
                 <w:sz w:val="24"/>
                 <w:szCs w:val="24"/>
               </w:rPr>
-              <w:t xml:space="preserve">Q50</w:t>
+              <w:t xml:space="preserve">Q55</w:t>
             </w:r>
             <w:r>
               <w:rPr>
@@ -8681,7 +11023,7 @@
           <w:sz w:val="21"/>
           <w:szCs w:val="21"/>
         </w:rPr>
-        <w:t xml:space="preserve">2 items, Q51 to Q52, about 5 minutes. Write the letters in the right order.</w:t>
+        <w:t xml:space="preserve">2 items, Q56 to Q57, about 5 minutes. Write the letters in the right order.</w:t>
       </w:r>
     </w:p>
     <w:tbl>
@@ -8731,7 +11073,7 @@
                 <w:sz w:val="24"/>
                 <w:szCs w:val="24"/>
               </w:rPr>
-              <w:t xml:space="preserve">Q51</w:t>
+              <w:t xml:space="preserve">Q56</w:t>
             </w:r>
             <w:r>
               <w:rPr>
@@ -8943,7 +11285,7 @@
                 <w:sz w:val="24"/>
                 <w:szCs w:val="24"/>
               </w:rPr>
-              <w:t xml:space="preserve">Q52</w:t>
+              <w:t xml:space="preserve">Q57</w:t>
             </w:r>
             <w:r>
               <w:rPr>
@@ -9074,6 +11416,374 @@
                 <w:szCs w:val="21"/>
               </w:rPr>
               <w:t xml:space="preserve">Order:  ______________________________</w:t>
+            </w:r>
+          </w:p>
+        </w:tc>
+      </w:tr>
+    </w:tbl>
+    <w:p>
+      <w:pPr>
+        <w:spacing w:after="100"/>
+      </w:pPr>
+    </w:p>
+    <w:p>
+      <w:r>
+        <w:br w:type="page"/>
+      </w:r>
+    </w:p>
+    <w:p>
+      <w:pPr>
+        <w:spacing w:after="100" w:before="0"/>
+      </w:pPr>
+      <w:r>
+        <w:rPr>
+          <w:rFonts w:ascii="Georgia" w:cs="Georgia" w:eastAsia="Georgia" w:hAnsi="Georgia"/>
+          <w:color w:val="1A0F5C"/>
+          <w:sz w:val="30"/>
+          <w:szCs w:val="30"/>
+        </w:rPr>
+        <w:t xml:space="preserve">Stretch: untimed, and not marked</w:t>
+      </w:r>
+    </w:p>
+    <w:p>
+      <w:pPr>
+        <w:spacing w:after="160"/>
+      </w:pPr>
+      <w:r>
+        <w:rPr>
+          <w:color w:val="6B6690"/>
+          <w:sz w:val="21"/>
+          <w:szCs w:val="21"/>
+        </w:rPr>
+        <w:t xml:space="preserve">For anyone who finishes early. Nothing here is counted; each item is the kind an interviewer asks after your first answer, so write the answer you would say.</w:t>
+      </w:r>
+    </w:p>
+    <w:tbl>
+      <w:tblPr>
+        <w:tblW w:type="dxa" w:w="9806"/>
+        <w:tblBorders>
+          <w:top w:val="single" w:color="auto" w:sz="4"/>
+          <w:left w:val="single" w:color="auto" w:sz="4"/>
+          <w:bottom w:val="single" w:color="auto" w:sz="4"/>
+          <w:right w:val="single" w:color="auto" w:sz="4"/>
+          <w:insideH w:val="single" w:color="auto" w:sz="4"/>
+          <w:insideV w:val="single" w:color="auto" w:sz="4"/>
+        </w:tblBorders>
+      </w:tblPr>
+      <w:tblGrid>
+        <w:gridCol w:w="9806"/>
+      </w:tblGrid>
+      <w:tr>
+        <w:trPr>
+          <w:cantSplit/>
+        </w:trPr>
+        <w:tc>
+          <w:tcPr>
+            <w:tcW w:type="dxa" w:w="9806"/>
+            <w:tcBorders>
+              <w:top w:val="single" w:color="CFC9EE" w:sz="6"/>
+              <w:left w:val="single" w:color="CFC9EE" w:sz="6"/>
+              <w:bottom w:val="single" w:color="CFC9EE" w:sz="6"/>
+              <w:right w:val="single" w:color="CFC9EE" w:sz="6"/>
+            </w:tcBorders>
+            <w:tcMar>
+              <w:top w:type="dxa" w:w="90"/>
+              <w:left w:type="dxa" w:w="140"/>
+              <w:bottom w:type="dxa" w:w="90"/>
+              <w:right w:type="dxa" w:w="140"/>
+            </w:tcMar>
+          </w:tcPr>
+          <w:p>
+            <w:pPr>
+              <w:spacing w:after="80"/>
+            </w:pPr>
+            <w:r>
+              <w:rPr>
+                <w:b/>
+                <w:bCs/>
+                <w:color w:val="5B3FD6"/>
+                <w:sz w:val="22"/>
+                <w:szCs w:val="22"/>
+              </w:rPr>
+              <w:t xml:space="preserve">Stretch 1</w:t>
+            </w:r>
+          </w:p>
+          <w:p>
+            <w:pPr>
+              <w:spacing w:after="80"/>
+            </w:pPr>
+            <w:r>
+              <w:rPr>
+                <w:color w:val="1A0F5C"/>
+                <w:sz w:val="21"/>
+                <w:szCs w:val="21"/>
+              </w:rPr>
+              <w:t xml:space="preserve">Marketing concedes that frequency fell but says acquisition is still the cheaper way to add Rs 1 crore of revenue. What would you need to see before agreeing, and how would you say it to Meera in three sentences?</w:t>
+            </w:r>
+          </w:p>
+          <w:p>
+            <w:pPr>
+              <w:spacing w:after="1400"/>
+            </w:pPr>
+            <w:r>
+              <w:rPr>
+                <w:color w:val="1A0F5C"/>
+                <w:sz w:val="21"/>
+                <w:szCs w:val="21"/>
+              </w:rPr>
+              <w:t xml:space="preserve"/>
+            </w:r>
+          </w:p>
+        </w:tc>
+      </w:tr>
+    </w:tbl>
+    <w:p>
+      <w:pPr>
+        <w:spacing w:after="100"/>
+      </w:pPr>
+    </w:p>
+    <w:tbl>
+      <w:tblPr>
+        <w:tblW w:type="dxa" w:w="9806"/>
+        <w:tblBorders>
+          <w:top w:val="single" w:color="auto" w:sz="4"/>
+          <w:left w:val="single" w:color="auto" w:sz="4"/>
+          <w:bottom w:val="single" w:color="auto" w:sz="4"/>
+          <w:right w:val="single" w:color="auto" w:sz="4"/>
+          <w:insideH w:val="single" w:color="auto" w:sz="4"/>
+          <w:insideV w:val="single" w:color="auto" w:sz="4"/>
+        </w:tblBorders>
+      </w:tblPr>
+      <w:tblGrid>
+        <w:gridCol w:w="9806"/>
+      </w:tblGrid>
+      <w:tr>
+        <w:trPr>
+          <w:cantSplit/>
+        </w:trPr>
+        <w:tc>
+          <w:tcPr>
+            <w:tcW w:type="dxa" w:w="9806"/>
+            <w:tcBorders>
+              <w:top w:val="single" w:color="CFC9EE" w:sz="6"/>
+              <w:left w:val="single" w:color="CFC9EE" w:sz="6"/>
+              <w:bottom w:val="single" w:color="CFC9EE" w:sz="6"/>
+              <w:right w:val="single" w:color="CFC9EE" w:sz="6"/>
+            </w:tcBorders>
+            <w:tcMar>
+              <w:top w:type="dxa" w:w="90"/>
+              <w:left w:type="dxa" w:w="140"/>
+              <w:bottom w:type="dxa" w:w="90"/>
+              <w:right w:type="dxa" w:w="140"/>
+            </w:tcMar>
+          </w:tcPr>
+          <w:p>
+            <w:pPr>
+              <w:spacing w:after="80"/>
+            </w:pPr>
+            <w:r>
+              <w:rPr>
+                <w:b/>
+                <w:bCs/>
+                <w:color w:val="5B3FD6"/>
+                <w:sz w:val="22"/>
+                <w:szCs w:val="22"/>
+              </w:rPr>
+              <w:t xml:space="preserve">Stretch 2</w:t>
+            </w:r>
+          </w:p>
+          <w:p>
+            <w:pPr>
+              <w:spacing w:after="80"/>
+            </w:pPr>
+            <w:r>
+              <w:rPr>
+                <w:color w:val="1A0F5C"/>
+                <w:sz w:val="21"/>
+                <w:szCs w:val="21"/>
+              </w:rPr>
+              <w:t xml:space="preserve">A shuffle test on the gap between two segments returns p = 0.03. Meera asks, "So we are 97 percent sure?" Answer in two sentences she can repeat to the board.</w:t>
+            </w:r>
+          </w:p>
+          <w:p>
+            <w:pPr>
+              <w:spacing w:after="1400"/>
+            </w:pPr>
+            <w:r>
+              <w:rPr>
+                <w:color w:val="1A0F5C"/>
+                <w:sz w:val="21"/>
+                <w:szCs w:val="21"/>
+              </w:rPr>
+              <w:t xml:space="preserve"/>
+            </w:r>
+          </w:p>
+        </w:tc>
+      </w:tr>
+    </w:tbl>
+    <w:p>
+      <w:pPr>
+        <w:spacing w:after="100"/>
+      </w:pPr>
+    </w:p>
+    <w:tbl>
+      <w:tblPr>
+        <w:tblW w:type="dxa" w:w="9806"/>
+        <w:tblBorders>
+          <w:top w:val="single" w:color="auto" w:sz="4"/>
+          <w:left w:val="single" w:color="auto" w:sz="4"/>
+          <w:bottom w:val="single" w:color="auto" w:sz="4"/>
+          <w:right w:val="single" w:color="auto" w:sz="4"/>
+          <w:insideH w:val="single" w:color="auto" w:sz="4"/>
+          <w:insideV w:val="single" w:color="auto" w:sz="4"/>
+        </w:tblBorders>
+      </w:tblPr>
+      <w:tblGrid>
+        <w:gridCol w:w="9806"/>
+      </w:tblGrid>
+      <w:tr>
+        <w:trPr>
+          <w:cantSplit/>
+        </w:trPr>
+        <w:tc>
+          <w:tcPr>
+            <w:tcW w:type="dxa" w:w="9806"/>
+            <w:tcBorders>
+              <w:top w:val="single" w:color="CFC9EE" w:sz="6"/>
+              <w:left w:val="single" w:color="CFC9EE" w:sz="6"/>
+              <w:bottom w:val="single" w:color="CFC9EE" w:sz="6"/>
+              <w:right w:val="single" w:color="CFC9EE" w:sz="6"/>
+            </w:tcBorders>
+            <w:tcMar>
+              <w:top w:type="dxa" w:w="90"/>
+              <w:left w:type="dxa" w:w="140"/>
+              <w:bottom w:type="dxa" w:w="90"/>
+              <w:right w:type="dxa" w:w="140"/>
+            </w:tcMar>
+          </w:tcPr>
+          <w:p>
+            <w:pPr>
+              <w:spacing w:after="80"/>
+            </w:pPr>
+            <w:r>
+              <w:rPr>
+                <w:b/>
+                <w:bCs/>
+                <w:color w:val="5B3FD6"/>
+                <w:sz w:val="22"/>
+                <w:szCs w:val="22"/>
+              </w:rPr>
+              <w:t xml:space="preserve">Stretch 3</w:t>
+            </w:r>
+          </w:p>
+          <w:p>
+            <w:pPr>
+              <w:spacing w:after="80"/>
+            </w:pPr>
+            <w:r>
+              <w:rPr>
+                <w:color w:val="1A0F5C"/>
+                <w:sz w:val="21"/>
+                <w:szCs w:val="21"/>
+              </w:rPr>
+              <w:t xml:space="preserve">An auditor asks you to walk through the rows your cleaning run removed. Describe the four things you show them, in order.</w:t>
+            </w:r>
+          </w:p>
+          <w:p>
+            <w:pPr>
+              <w:spacing w:after="1400"/>
+            </w:pPr>
+            <w:r>
+              <w:rPr>
+                <w:color w:val="1A0F5C"/>
+                <w:sz w:val="21"/>
+                <w:szCs w:val="21"/>
+              </w:rPr>
+              <w:t xml:space="preserve"/>
+            </w:r>
+          </w:p>
+        </w:tc>
+      </w:tr>
+    </w:tbl>
+    <w:p>
+      <w:pPr>
+        <w:spacing w:after="100"/>
+      </w:pPr>
+    </w:p>
+    <w:tbl>
+      <w:tblPr>
+        <w:tblW w:type="dxa" w:w="9806"/>
+        <w:tblBorders>
+          <w:top w:val="single" w:color="auto" w:sz="4"/>
+          <w:left w:val="single" w:color="auto" w:sz="4"/>
+          <w:bottom w:val="single" w:color="auto" w:sz="4"/>
+          <w:right w:val="single" w:color="auto" w:sz="4"/>
+          <w:insideH w:val="single" w:color="auto" w:sz="4"/>
+          <w:insideV w:val="single" w:color="auto" w:sz="4"/>
+        </w:tblBorders>
+      </w:tblPr>
+      <w:tblGrid>
+        <w:gridCol w:w="9806"/>
+      </w:tblGrid>
+      <w:tr>
+        <w:trPr>
+          <w:cantSplit/>
+        </w:trPr>
+        <w:tc>
+          <w:tcPr>
+            <w:tcW w:type="dxa" w:w="9806"/>
+            <w:tcBorders>
+              <w:top w:val="single" w:color="CFC9EE" w:sz="6"/>
+              <w:left w:val="single" w:color="CFC9EE" w:sz="6"/>
+              <w:bottom w:val="single" w:color="CFC9EE" w:sz="6"/>
+              <w:right w:val="single" w:color="CFC9EE" w:sz="6"/>
+            </w:tcBorders>
+            <w:tcMar>
+              <w:top w:type="dxa" w:w="90"/>
+              <w:left w:type="dxa" w:w="140"/>
+              <w:bottom w:type="dxa" w:w="90"/>
+              <w:right w:type="dxa" w:w="140"/>
+            </w:tcMar>
+          </w:tcPr>
+          <w:p>
+            <w:pPr>
+              <w:spacing w:after="80"/>
+            </w:pPr>
+            <w:r>
+              <w:rPr>
+                <w:b/>
+                <w:bCs/>
+                <w:color w:val="5B3FD6"/>
+                <w:sz w:val="22"/>
+                <w:szCs w:val="22"/>
+              </w:rPr>
+              <w:t xml:space="preserve">Stretch 4</w:t>
+            </w:r>
+          </w:p>
+          <w:p>
+            <w:pPr>
+              <w:spacing w:after="80"/>
+            </w:pPr>
+            <w:r>
+              <w:rPr>
+                <w:color w:val="1A0F5C"/>
+                <w:sz w:val="21"/>
+                <w:szCs w:val="21"/>
+              </w:rPr>
+              <w:t xml:space="preserve">You have two hours and a raw export, and Meera wants the Q1 figure by lunch. What do you do first, what do you skip, and what do you refuse to skip?</w:t>
+            </w:r>
+          </w:p>
+          <w:p>
+            <w:pPr>
+              <w:spacing w:after="1400"/>
+            </w:pPr>
+            <w:r>
+              <w:rPr>
+                <w:color w:val="1A0F5C"/>
+                <w:sz w:val="21"/>
+                <w:szCs w:val="21"/>
+              </w:rPr>
+              <w:t xml:space="preserve"/>
             </w:r>
           </w:p>
         </w:tc>
@@ -9328,7 +12038,7 @@
                 <w:sz w:val="18"/>
                 <w:szCs w:val="18"/>
               </w:rPr>
-              <w:t xml:space="preserve">____ of 52</w:t>
+              <w:t xml:space="preserve">____ of 57</w:t>
             </w:r>
           </w:p>
         </w:tc>
@@ -9453,7 +12163,7 @@
                 <w:sz w:val="17"/>
                 <w:szCs w:val="17"/>
               </w:rPr>
-              <w:t xml:space="preserve">Q27</w:t>
+              <w:t xml:space="preserve">Q30</w:t>
             </w:r>
           </w:p>
         </w:tc>
@@ -9586,7 +12296,7 @@
                 <w:sz w:val="17"/>
                 <w:szCs w:val="17"/>
               </w:rPr>
-              <w:t xml:space="preserve">Q28</w:t>
+              <w:t xml:space="preserve">Q31</w:t>
             </w:r>
           </w:p>
         </w:tc>
@@ -9719,7 +12429,7 @@
                 <w:sz w:val="17"/>
                 <w:szCs w:val="17"/>
               </w:rPr>
-              <w:t xml:space="preserve">Q29</w:t>
+              <w:t xml:space="preserve">Q32</w:t>
             </w:r>
           </w:p>
         </w:tc>
@@ -9852,7 +12562,7 @@
                 <w:sz w:val="17"/>
                 <w:szCs w:val="17"/>
               </w:rPr>
-              <w:t xml:space="preserve">Q30</w:t>
+              <w:t xml:space="preserve">Q33</w:t>
             </w:r>
           </w:p>
         </w:tc>
@@ -9985,7 +12695,7 @@
                 <w:sz w:val="17"/>
                 <w:szCs w:val="17"/>
               </w:rPr>
-              <w:t xml:space="preserve">Q31</w:t>
+              <w:t xml:space="preserve">Q34</w:t>
             </w:r>
           </w:p>
         </w:tc>
@@ -10118,7 +12828,7 @@
                 <w:sz w:val="17"/>
                 <w:szCs w:val="17"/>
               </w:rPr>
-              <w:t xml:space="preserve">Q32</w:t>
+              <w:t xml:space="preserve">Q35</w:t>
             </w:r>
           </w:p>
         </w:tc>
@@ -10251,7 +12961,7 @@
                 <w:sz w:val="17"/>
                 <w:szCs w:val="17"/>
               </w:rPr>
-              <w:t xml:space="preserve">Q33</w:t>
+              <w:t xml:space="preserve">Q36</w:t>
             </w:r>
           </w:p>
         </w:tc>
@@ -10384,7 +13094,7 @@
                 <w:sz w:val="17"/>
                 <w:szCs w:val="17"/>
               </w:rPr>
-              <w:t xml:space="preserve">Q34</w:t>
+              <w:t xml:space="preserve">Q37</w:t>
             </w:r>
           </w:p>
         </w:tc>
@@ -10517,7 +13227,7 @@
                 <w:sz w:val="17"/>
                 <w:szCs w:val="17"/>
               </w:rPr>
-              <w:t xml:space="preserve">Q35</w:t>
+              <w:t xml:space="preserve">Q38</w:t>
             </w:r>
           </w:p>
         </w:tc>
@@ -10549,7 +13259,7 @@
                 <w:sz w:val="17"/>
                 <w:szCs w:val="17"/>
               </w:rPr>
-              <w:t xml:space="preserve">○ a     ○ b     ○ c     ○ d</w:t>
+              <w:t xml:space="preserve">______________________________</w:t>
             </w:r>
           </w:p>
         </w:tc>
@@ -10650,7 +13360,7 @@
                 <w:sz w:val="17"/>
                 <w:szCs w:val="17"/>
               </w:rPr>
-              <w:t xml:space="preserve">Q36</w:t>
+              <w:t xml:space="preserve">Q39</w:t>
             </w:r>
           </w:p>
         </w:tc>
@@ -10783,7 +13493,7 @@
                 <w:sz w:val="17"/>
                 <w:szCs w:val="17"/>
               </w:rPr>
-              <w:t xml:space="preserve">Q37</w:t>
+              <w:t xml:space="preserve">Q40</w:t>
             </w:r>
           </w:p>
         </w:tc>
@@ -10815,7 +13525,7 @@
                 <w:sz w:val="17"/>
                 <w:szCs w:val="17"/>
               </w:rPr>
-              <w:t xml:space="preserve">○ a     ○ b     ○ c     ○ d</w:t>
+              <w:t xml:space="preserve">______________________________</w:t>
             </w:r>
           </w:p>
         </w:tc>
@@ -10916,7 +13626,7 @@
                 <w:sz w:val="17"/>
                 <w:szCs w:val="17"/>
               </w:rPr>
-              <w:t xml:space="preserve">Q38</w:t>
+              <w:t xml:space="preserve">Q41</w:t>
             </w:r>
           </w:p>
         </w:tc>
@@ -11049,7 +13759,7 @@
                 <w:sz w:val="17"/>
                 <w:szCs w:val="17"/>
               </w:rPr>
-              <w:t xml:space="preserve">Q39</w:t>
+              <w:t xml:space="preserve">Q42</w:t>
             </w:r>
           </w:p>
         </w:tc>
@@ -11182,7 +13892,7 @@
                 <w:sz w:val="17"/>
                 <w:szCs w:val="17"/>
               </w:rPr>
-              <w:t xml:space="preserve">Q40</w:t>
+              <w:t xml:space="preserve">Q43</w:t>
             </w:r>
           </w:p>
         </w:tc>
@@ -11214,7 +13924,7 @@
                 <w:sz w:val="17"/>
                 <w:szCs w:val="17"/>
               </w:rPr>
-              <w:t xml:space="preserve">______________________________</w:t>
+              <w:t xml:space="preserve">○ a     ○ b     ○ c     ○ d</w:t>
             </w:r>
           </w:p>
         </w:tc>
@@ -11315,7 +14025,7 @@
                 <w:sz w:val="17"/>
                 <w:szCs w:val="17"/>
               </w:rPr>
-              <w:t xml:space="preserve">Q41</w:t>
+              <w:t xml:space="preserve">Q44</w:t>
             </w:r>
           </w:p>
         </w:tc>
@@ -11448,7 +14158,7 @@
                 <w:sz w:val="17"/>
                 <w:szCs w:val="17"/>
               </w:rPr>
-              <w:t xml:space="preserve">Q42</w:t>
+              <w:t xml:space="preserve">Q45</w:t>
             </w:r>
           </w:p>
         </w:tc>
@@ -11581,7 +14291,7 @@
                 <w:sz w:val="17"/>
                 <w:szCs w:val="17"/>
               </w:rPr>
-              <w:t xml:space="preserve">Q43</w:t>
+              <w:t xml:space="preserve">Q46</w:t>
             </w:r>
           </w:p>
         </w:tc>
@@ -11613,7 +14323,7 @@
                 <w:sz w:val="17"/>
                 <w:szCs w:val="17"/>
               </w:rPr>
-              <w:t xml:space="preserve">○ a     ○ b     ○ c     ○ d</w:t>
+              <w:t xml:space="preserve">______________________________</w:t>
             </w:r>
           </w:p>
         </w:tc>
@@ -11714,7 +14424,7 @@
                 <w:sz w:val="17"/>
                 <w:szCs w:val="17"/>
               </w:rPr>
-              <w:t xml:space="preserve">Q44</w:t>
+              <w:t xml:space="preserve">Q47</w:t>
             </w:r>
           </w:p>
         </w:tc>
@@ -11847,7 +14557,7 @@
                 <w:sz w:val="17"/>
                 <w:szCs w:val="17"/>
               </w:rPr>
-              <w:t xml:space="preserve">Q45</w:t>
+              <w:t xml:space="preserve">Q48</w:t>
             </w:r>
           </w:p>
         </w:tc>
@@ -11980,7 +14690,7 @@
                 <w:sz w:val="17"/>
                 <w:szCs w:val="17"/>
               </w:rPr>
-              <w:t xml:space="preserve">Q46</w:t>
+              <w:t xml:space="preserve">Q49</w:t>
             </w:r>
           </w:p>
         </w:tc>
@@ -12012,7 +14722,7 @@
                 <w:sz w:val="17"/>
                 <w:szCs w:val="17"/>
               </w:rPr>
-              <w:t xml:space="preserve">______________________________</w:t>
+              <w:t xml:space="preserve">○ a     ○ b     ○ c     ○ d</w:t>
             </w:r>
           </w:p>
         </w:tc>
@@ -12113,7 +14823,7 @@
                 <w:sz w:val="17"/>
                 <w:szCs w:val="17"/>
               </w:rPr>
-              <w:t xml:space="preserve">Q47</w:t>
+              <w:t xml:space="preserve">Q50</w:t>
             </w:r>
           </w:p>
         </w:tc>
@@ -12145,7 +14855,7 @@
                 <w:sz w:val="17"/>
                 <w:szCs w:val="17"/>
               </w:rPr>
-              <w:t xml:space="preserve">______________________________</w:t>
+              <w:t xml:space="preserve">○ a     ○ b     ○ c     ○ d</w:t>
             </w:r>
           </w:p>
         </w:tc>
@@ -12246,7 +14956,7 @@
                 <w:sz w:val="17"/>
                 <w:szCs w:val="17"/>
               </w:rPr>
-              <w:t xml:space="preserve">Q48</w:t>
+              <w:t xml:space="preserve">Q51</w:t>
             </w:r>
           </w:p>
         </w:tc>
@@ -12379,7 +15089,7 @@
                 <w:sz w:val="17"/>
                 <w:szCs w:val="17"/>
               </w:rPr>
-              <w:t xml:space="preserve">Q49</w:t>
+              <w:t xml:space="preserve">Q52</w:t>
             </w:r>
           </w:p>
         </w:tc>
@@ -12512,7 +15222,7 @@
                 <w:sz w:val="17"/>
                 <w:szCs w:val="17"/>
               </w:rPr>
-              <w:t xml:space="preserve">Q50</w:t>
+              <w:t xml:space="preserve">Q53</w:t>
             </w:r>
           </w:p>
         </w:tc>
@@ -12645,7 +15355,7 @@
                 <w:sz w:val="17"/>
                 <w:szCs w:val="17"/>
               </w:rPr>
-              <w:t xml:space="preserve">Q51</w:t>
+              <w:t xml:space="preserve">Q54</w:t>
             </w:r>
           </w:p>
         </w:tc>
@@ -12778,7 +15488,7 @@
                 <w:sz w:val="17"/>
                 <w:szCs w:val="17"/>
               </w:rPr>
-              <w:t xml:space="preserve">Q52</w:t>
+              <w:t xml:space="preserve">Q55</w:t>
             </w:r>
           </w:p>
         </w:tc>
@@ -12811,6 +15521,405 @@
                 <w:szCs w:val="17"/>
               </w:rPr>
               <w:t xml:space="preserve">______________________________</w:t>
+            </w:r>
+          </w:p>
+        </w:tc>
+      </w:tr>
+      <w:tr>
+        <w:trPr>
+          <w:cantSplit/>
+        </w:trPr>
+        <w:tc>
+          <w:tcPr>
+            <w:tcW w:type="dxa" w:w="700"/>
+            <w:tcBorders>
+              <w:top w:val="single" w:color="CFC9EE" w:sz="6"/>
+              <w:left w:val="single" w:color="CFC9EE" w:sz="6"/>
+              <w:bottom w:val="single" w:color="CFC9EE" w:sz="6"/>
+              <w:right w:val="single" w:color="CFC9EE" w:sz="6"/>
+            </w:tcBorders>
+            <w:tcMar>
+              <w:top w:type="dxa" w:w="30"/>
+              <w:left w:type="dxa" w:w="110"/>
+              <w:bottom w:type="dxa" w:w="30"/>
+              <w:right w:type="dxa" w:w="110"/>
+            </w:tcMar>
+          </w:tcPr>
+          <w:p>
+            <w:pPr>
+              <w:spacing w:after="0"/>
+            </w:pPr>
+            <w:r>
+              <w:rPr>
+                <w:b/>
+                <w:bCs/>
+                <w:color w:val="5B3FD6"/>
+                <w:sz w:val="17"/>
+                <w:szCs w:val="17"/>
+              </w:rPr>
+              <w:t xml:space="preserve">Q27</w:t>
+            </w:r>
+          </w:p>
+        </w:tc>
+        <w:tc>
+          <w:tcPr>
+            <w:tcW w:type="dxa" w:w="4143"/>
+            <w:tcBorders>
+              <w:top w:val="single" w:color="CFC9EE" w:sz="6"/>
+              <w:left w:val="single" w:color="CFC9EE" w:sz="6"/>
+              <w:bottom w:val="single" w:color="CFC9EE" w:sz="6"/>
+              <w:right w:val="single" w:color="CFC9EE" w:sz="6"/>
+            </w:tcBorders>
+            <w:tcMar>
+              <w:top w:type="dxa" w:w="30"/>
+              <w:left w:type="dxa" w:w="110"/>
+              <w:bottom w:type="dxa" w:w="30"/>
+              <w:right w:type="dxa" w:w="110"/>
+            </w:tcMar>
+          </w:tcPr>
+          <w:p>
+            <w:pPr>
+              <w:spacing w:after="0"/>
+            </w:pPr>
+            <w:r>
+              <w:rPr>
+                <w:b w:val="false"/>
+                <w:bCs w:val="false"/>
+                <w:color w:val="1A0F5C"/>
+                <w:sz w:val="17"/>
+                <w:szCs w:val="17"/>
+              </w:rPr>
+              <w:t xml:space="preserve">○ a     ○ b     ○ c     ○ d</w:t>
+            </w:r>
+          </w:p>
+        </w:tc>
+        <w:tc>
+          <w:tcPr>
+            <w:tcW w:type="dxa" w:w="700"/>
+            <w:tcBorders>
+              <w:top w:val="single" w:color="CFC9EE" w:sz="6"/>
+              <w:left w:val="single" w:color="CFC9EE" w:sz="6"/>
+              <w:bottom w:val="single" w:color="CFC9EE" w:sz="6"/>
+              <w:right w:val="single" w:color="CFC9EE" w:sz="6"/>
+            </w:tcBorders>
+            <w:tcMar>
+              <w:top w:type="dxa" w:w="30"/>
+              <w:left w:type="dxa" w:w="110"/>
+              <w:bottom w:type="dxa" w:w="30"/>
+              <w:right w:type="dxa" w:w="110"/>
+            </w:tcMar>
+          </w:tcPr>
+          <w:p>
+            <w:pPr>
+              <w:spacing w:after="0"/>
+            </w:pPr>
+            <w:r>
+              <w:rPr>
+                <w:b/>
+                <w:bCs/>
+                <w:color w:val="5B3FD6"/>
+                <w:sz w:val="17"/>
+                <w:szCs w:val="17"/>
+              </w:rPr>
+              <w:t xml:space="preserve">Q56</w:t>
+            </w:r>
+          </w:p>
+        </w:tc>
+        <w:tc>
+          <w:tcPr>
+            <w:tcW w:type="dxa" w:w="4143"/>
+            <w:tcBorders>
+              <w:top w:val="single" w:color="CFC9EE" w:sz="6"/>
+              <w:left w:val="single" w:color="CFC9EE" w:sz="6"/>
+              <w:bottom w:val="single" w:color="CFC9EE" w:sz="6"/>
+              <w:right w:val="single" w:color="CFC9EE" w:sz="6"/>
+            </w:tcBorders>
+            <w:tcMar>
+              <w:top w:type="dxa" w:w="30"/>
+              <w:left w:type="dxa" w:w="110"/>
+              <w:bottom w:type="dxa" w:w="30"/>
+              <w:right w:type="dxa" w:w="110"/>
+            </w:tcMar>
+          </w:tcPr>
+          <w:p>
+            <w:pPr>
+              <w:spacing w:after="0"/>
+            </w:pPr>
+            <w:r>
+              <w:rPr>
+                <w:b w:val="false"/>
+                <w:bCs w:val="false"/>
+                <w:color w:val="1A0F5C"/>
+                <w:sz w:val="17"/>
+                <w:szCs w:val="17"/>
+              </w:rPr>
+              <w:t xml:space="preserve">______________________________</w:t>
+            </w:r>
+          </w:p>
+        </w:tc>
+      </w:tr>
+      <w:tr>
+        <w:trPr>
+          <w:cantSplit/>
+        </w:trPr>
+        <w:tc>
+          <w:tcPr>
+            <w:tcW w:type="dxa" w:w="700"/>
+            <w:tcBorders>
+              <w:top w:val="single" w:color="CFC9EE" w:sz="6"/>
+              <w:left w:val="single" w:color="CFC9EE" w:sz="6"/>
+              <w:bottom w:val="single" w:color="CFC9EE" w:sz="6"/>
+              <w:right w:val="single" w:color="CFC9EE" w:sz="6"/>
+            </w:tcBorders>
+            <w:tcMar>
+              <w:top w:type="dxa" w:w="30"/>
+              <w:left w:type="dxa" w:w="110"/>
+              <w:bottom w:type="dxa" w:w="30"/>
+              <w:right w:type="dxa" w:w="110"/>
+            </w:tcMar>
+          </w:tcPr>
+          <w:p>
+            <w:pPr>
+              <w:spacing w:after="0"/>
+            </w:pPr>
+            <w:r>
+              <w:rPr>
+                <w:b/>
+                <w:bCs/>
+                <w:color w:val="5B3FD6"/>
+                <w:sz w:val="17"/>
+                <w:szCs w:val="17"/>
+              </w:rPr>
+              <w:t xml:space="preserve">Q28</w:t>
+            </w:r>
+          </w:p>
+        </w:tc>
+        <w:tc>
+          <w:tcPr>
+            <w:tcW w:type="dxa" w:w="4143"/>
+            <w:tcBorders>
+              <w:top w:val="single" w:color="CFC9EE" w:sz="6"/>
+              <w:left w:val="single" w:color="CFC9EE" w:sz="6"/>
+              <w:bottom w:val="single" w:color="CFC9EE" w:sz="6"/>
+              <w:right w:val="single" w:color="CFC9EE" w:sz="6"/>
+            </w:tcBorders>
+            <w:tcMar>
+              <w:top w:type="dxa" w:w="30"/>
+              <w:left w:type="dxa" w:w="110"/>
+              <w:bottom w:type="dxa" w:w="30"/>
+              <w:right w:type="dxa" w:w="110"/>
+            </w:tcMar>
+          </w:tcPr>
+          <w:p>
+            <w:pPr>
+              <w:spacing w:after="0"/>
+            </w:pPr>
+            <w:r>
+              <w:rPr>
+                <w:b w:val="false"/>
+                <w:bCs w:val="false"/>
+                <w:color w:val="1A0F5C"/>
+                <w:sz w:val="17"/>
+                <w:szCs w:val="17"/>
+              </w:rPr>
+              <w:t xml:space="preserve">○ a     ○ b     ○ c     ○ d</w:t>
+            </w:r>
+          </w:p>
+        </w:tc>
+        <w:tc>
+          <w:tcPr>
+            <w:tcW w:type="dxa" w:w="700"/>
+            <w:tcBorders>
+              <w:top w:val="single" w:color="CFC9EE" w:sz="6"/>
+              <w:left w:val="single" w:color="CFC9EE" w:sz="6"/>
+              <w:bottom w:val="single" w:color="CFC9EE" w:sz="6"/>
+              <w:right w:val="single" w:color="CFC9EE" w:sz="6"/>
+            </w:tcBorders>
+            <w:tcMar>
+              <w:top w:type="dxa" w:w="30"/>
+              <w:left w:type="dxa" w:w="110"/>
+              <w:bottom w:type="dxa" w:w="30"/>
+              <w:right w:type="dxa" w:w="110"/>
+            </w:tcMar>
+          </w:tcPr>
+          <w:p>
+            <w:pPr>
+              <w:spacing w:after="0"/>
+            </w:pPr>
+            <w:r>
+              <w:rPr>
+                <w:b/>
+                <w:bCs/>
+                <w:color w:val="5B3FD6"/>
+                <w:sz w:val="17"/>
+                <w:szCs w:val="17"/>
+              </w:rPr>
+              <w:t xml:space="preserve">Q57</w:t>
+            </w:r>
+          </w:p>
+        </w:tc>
+        <w:tc>
+          <w:tcPr>
+            <w:tcW w:type="dxa" w:w="4143"/>
+            <w:tcBorders>
+              <w:top w:val="single" w:color="CFC9EE" w:sz="6"/>
+              <w:left w:val="single" w:color="CFC9EE" w:sz="6"/>
+              <w:bottom w:val="single" w:color="CFC9EE" w:sz="6"/>
+              <w:right w:val="single" w:color="CFC9EE" w:sz="6"/>
+            </w:tcBorders>
+            <w:tcMar>
+              <w:top w:type="dxa" w:w="30"/>
+              <w:left w:type="dxa" w:w="110"/>
+              <w:bottom w:type="dxa" w:w="30"/>
+              <w:right w:type="dxa" w:w="110"/>
+            </w:tcMar>
+          </w:tcPr>
+          <w:p>
+            <w:pPr>
+              <w:spacing w:after="0"/>
+            </w:pPr>
+            <w:r>
+              <w:rPr>
+                <w:b w:val="false"/>
+                <w:bCs w:val="false"/>
+                <w:color w:val="1A0F5C"/>
+                <w:sz w:val="17"/>
+                <w:szCs w:val="17"/>
+              </w:rPr>
+              <w:t xml:space="preserve">______________________________</w:t>
+            </w:r>
+          </w:p>
+        </w:tc>
+      </w:tr>
+      <w:tr>
+        <w:trPr>
+          <w:cantSplit/>
+        </w:trPr>
+        <w:tc>
+          <w:tcPr>
+            <w:tcW w:type="dxa" w:w="700"/>
+            <w:tcBorders>
+              <w:top w:val="single" w:color="CFC9EE" w:sz="6"/>
+              <w:left w:val="single" w:color="CFC9EE" w:sz="6"/>
+              <w:bottom w:val="single" w:color="CFC9EE" w:sz="6"/>
+              <w:right w:val="single" w:color="CFC9EE" w:sz="6"/>
+            </w:tcBorders>
+            <w:tcMar>
+              <w:top w:type="dxa" w:w="30"/>
+              <w:left w:type="dxa" w:w="110"/>
+              <w:bottom w:type="dxa" w:w="30"/>
+              <w:right w:type="dxa" w:w="110"/>
+            </w:tcMar>
+          </w:tcPr>
+          <w:p>
+            <w:pPr>
+              <w:spacing w:after="0"/>
+            </w:pPr>
+            <w:r>
+              <w:rPr>
+                <w:b/>
+                <w:bCs/>
+                <w:color w:val="5B3FD6"/>
+                <w:sz w:val="17"/>
+                <w:szCs w:val="17"/>
+              </w:rPr>
+              <w:t xml:space="preserve">Q29</w:t>
+            </w:r>
+          </w:p>
+        </w:tc>
+        <w:tc>
+          <w:tcPr>
+            <w:tcW w:type="dxa" w:w="4143"/>
+            <w:tcBorders>
+              <w:top w:val="single" w:color="CFC9EE" w:sz="6"/>
+              <w:left w:val="single" w:color="CFC9EE" w:sz="6"/>
+              <w:bottom w:val="single" w:color="CFC9EE" w:sz="6"/>
+              <w:right w:val="single" w:color="CFC9EE" w:sz="6"/>
+            </w:tcBorders>
+            <w:tcMar>
+              <w:top w:type="dxa" w:w="30"/>
+              <w:left w:type="dxa" w:w="110"/>
+              <w:bottom w:type="dxa" w:w="30"/>
+              <w:right w:type="dxa" w:w="110"/>
+            </w:tcMar>
+          </w:tcPr>
+          <w:p>
+            <w:pPr>
+              <w:spacing w:after="0"/>
+            </w:pPr>
+            <w:r>
+              <w:rPr>
+                <w:b w:val="false"/>
+                <w:bCs w:val="false"/>
+                <w:color w:val="1A0F5C"/>
+                <w:sz w:val="17"/>
+                <w:szCs w:val="17"/>
+              </w:rPr>
+              <w:t xml:space="preserve">○ a     ○ b     ○ c     ○ d</w:t>
+            </w:r>
+          </w:p>
+        </w:tc>
+        <w:tc>
+          <w:tcPr>
+            <w:tcW w:type="dxa" w:w="700"/>
+            <w:tcBorders>
+              <w:top w:val="single" w:color="CFC9EE" w:sz="6"/>
+              <w:left w:val="single" w:color="CFC9EE" w:sz="6"/>
+              <w:bottom w:val="single" w:color="CFC9EE" w:sz="6"/>
+              <w:right w:val="single" w:color="CFC9EE" w:sz="6"/>
+            </w:tcBorders>
+            <w:tcMar>
+              <w:top w:type="dxa" w:w="30"/>
+              <w:left w:type="dxa" w:w="110"/>
+              <w:bottom w:type="dxa" w:w="30"/>
+              <w:right w:type="dxa" w:w="110"/>
+            </w:tcMar>
+          </w:tcPr>
+          <w:p>
+            <w:pPr>
+              <w:spacing w:after="0"/>
+            </w:pPr>
+            <w:r>
+              <w:rPr>
+                <w:b/>
+                <w:bCs/>
+                <w:color w:val="5B3FD6"/>
+                <w:sz w:val="17"/>
+                <w:szCs w:val="17"/>
+              </w:rPr>
+              <w:t xml:space="preserve"/>
+            </w:r>
+          </w:p>
+        </w:tc>
+        <w:tc>
+          <w:tcPr>
+            <w:tcW w:type="dxa" w:w="4143"/>
+            <w:tcBorders>
+              <w:top w:val="single" w:color="CFC9EE" w:sz="6"/>
+              <w:left w:val="single" w:color="CFC9EE" w:sz="6"/>
+              <w:bottom w:val="single" w:color="CFC9EE" w:sz="6"/>
+              <w:right w:val="single" w:color="CFC9EE" w:sz="6"/>
+            </w:tcBorders>
+            <w:tcMar>
+              <w:top w:type="dxa" w:w="30"/>
+              <w:left w:type="dxa" w:w="110"/>
+              <w:bottom w:type="dxa" w:w="30"/>
+              <w:right w:type="dxa" w:w="110"/>
+            </w:tcMar>
+          </w:tcPr>
+          <w:p>
+            <w:pPr>
+              <w:spacing w:after="0"/>
+            </w:pPr>
+            <w:r>
+              <w:rPr>
+                <w:b w:val="false"/>
+                <w:bCs w:val="false"/>
+                <w:color w:val="1A0F5C"/>
+                <w:sz w:val="17"/>
+                <w:szCs w:val="17"/>
+              </w:rPr>
+              <w:t xml:space="preserve"/>
             </w:r>
           </w:p>
         </w:tc>

</xml_diff>

<commit_message>
W01 SAT Word files rebuilt with the builder fix and no shim; provenance updated
Co-Authored-By: Claude Opus 5.5 <noreply@anthropic.com>
Claude-Session: https://claude.ai/code/session_01PkCqavtmoyKZmN4An9EQC9
</commit_message>
<xml_diff>
--- a/content/W01/SAT/paper/C2_W01_SAT_recap_paper_STUDENT.docx
+++ b/content/W01/SAT/paper/C2_W01_SAT_recap_paper_STUDENT.docx
@@ -10025,7 +10025,7 @@
             <w:r>
               <w:drawing>
                 <wp:inline distT="0" distB="0" distL="0" distR="0">
-                  <wp:extent cx="5810250" cy="3295650"/>
+                  <wp:extent cx="5257800" cy="2981325"/>
                   <wp:effectExtent t="0" r="0" b="0" l="0"/>
                   <wp:docPr id="1" name="" descr="" title=""/>
                   <wp:cNvGraphicFramePr>
@@ -10050,7 +10050,7 @@
                         <pic:spPr bwMode="auto">
                           <a:xfrm>
                             <a:off x="0" y="0"/>
-                            <a:ext cx="5810250" cy="3295650"/>
+                            <a:ext cx="5257800" cy="2981325"/>
                           </a:xfrm>
                           <a:prstGeom prst="rect">
                             <a:avLst/>

</xml_diff>

<commit_message>
W01 SAT: reword Q46 so its stem no longer gives Q2's answer
Q46 read 'divided by the number of distinct customers', which is Q2's blank.
The stem now reads 'Orders per customer in this export is ____.' Paper and key
rebuilt as markdown and Word.

Co-Authored-By: Claude Opus 5.5 <noreply@anthropic.com>
Claude-Session: https://claude.ai/code/session_018LZEJsWzRQhiD9cQgGbYhR
</commit_message>
<xml_diff>
--- a/content/W01/SAT/paper/C2_W01_SAT_recap_paper_STUDENT.docx
+++ b/content/W01/SAT/paper/C2_W01_SAT_recap_paper_STUDENT.docx
@@ -9662,7 +9662,7 @@
                 <w:sz w:val="21"/>
                 <w:szCs w:val="21"/>
               </w:rPr>
-              <w:t xml:space="preserve">Orders per customer, divided by the number of distinct customers, is ____.</w:t>
+              <w:t xml:space="preserve">Orders per customer in this export is ____.</w:t>
             </w:r>
           </w:p>
           <w:p>
@@ -10025,7 +10025,7 @@
             <w:r>
               <w:drawing>
                 <wp:inline distT="0" distB="0" distL="0" distR="0">
-                  <wp:extent cx="5257800" cy="2981325"/>
+                  <wp:extent cx="4638675" cy="1981200"/>
                   <wp:effectExtent t="0" r="0" b="0" l="0"/>
                   <wp:docPr id="1" name="" descr="" title=""/>
                   <wp:cNvGraphicFramePr>
@@ -10050,7 +10050,7 @@
                         <pic:spPr bwMode="auto">
                           <a:xfrm>
                             <a:off x="0" y="0"/>
-                            <a:ext cx="5257800" cy="2981325"/>
+                            <a:ext cx="4638675" cy="1981200"/>
                           </a:xfrm>
                           <a:prstGeom prst="rect">
                             <a:avLst/>

</xml_diff>

<commit_message>
Week 1 Saturday paper: a label on every item, and the first page's purpose and company
Each of the 54 printed items carries a label of two to five words beside its level on the
Word paper, saying what the item asks the reader to do with what is in front of it, in the
manner of the baseline diagnostic, with no label hinting at a key and none shared by
neighbours. The first page's "What this paper is for" now sets out the week's case in its
own terms, Meera's Rs 12 crore question, the Q1 figure Anand disputes and the discount at
Diwali, and says how Monday uses the result; the Rules table's Company row names Kalpa
Retail and the people the paper names, with their roles as the week's files give them.

Co-Authored-By: Claude Opus 5.5 <noreply@anthropic.com>
Claude-Session: https://claude.ai/code/session_01P7zaoR4dQ5pzBFnsX549JQ
</commit_message>
<xml_diff>
--- a/content/W01/SAT/paper/C2_W01_SAT_recap_paper_STUDENT.docx
+++ b/content/W01/SAT/paper/C2_W01_SAT_recap_paper_STUDENT.docx
@@ -68,7 +68,7 @@
           <w:sz w:val="21"/>
           <w:szCs w:val="21"/>
         </w:rPr>
-        <w:t xml:space="preserve">This paper finds which of the week's decisions you can make cold, with no notes and no assistant, so Monday's practice starts where each of us needs it. Every item is a Kalpa business question first and a technique question second, which is the order interviewers use.</w:t>
+        <w:t xml:space="preserve">This week Meera Raghavan asked whether the Rs 12 crore Marketing wants for acquisition goes to the branch of revenue that is actually short, Anand Iyer disputed the Q1 figure the ERP export put on the dashboard, and Meera now has to decide whether the monsoon discount runs again at Diwali. This paper puts those decisions in front of you once more, with no notebook, no notes and no assistant, to find which of them you can make cold. The room's scores in each part, set beside the ratings you give in step one, decide where Monday's revision starts. A wrong answer tells Monday more than a blank one, so answer every item.</w:t>
       </w:r>
     </w:p>
     <w:p>
@@ -555,6 +555,81 @@
                 <w:szCs w:val="18"/>
               </w:rPr>
               <w:t xml:space="preserve">An exhibit is printed once, labelled by its part as Exhibit 2A, 2B, and every item that reads it follows it. Read code and queries as written: Python 3 and PostgreSQL unless the item says otherwise.</w:t>
+            </w:r>
+          </w:p>
+        </w:tc>
+      </w:tr>
+      <w:tr>
+        <w:trPr>
+          <w:cantSplit/>
+        </w:trPr>
+        <w:tc>
+          <w:tcPr>
+            <w:tcW w:type="dxa" w:w="1500"/>
+            <w:tcBorders>
+              <w:top w:val="single" w:color="D5D0C4" w:sz="4"/>
+              <w:left w:val="single" w:color="D5D0C4" w:sz="4"/>
+              <w:bottom w:val="single" w:color="D5D0C4" w:sz="4"/>
+              <w:right w:val="single" w:color="D5D0C4" w:sz="4"/>
+            </w:tcBorders>
+            <w:tcMar>
+              <w:top w:type="dxa" w:w="40"/>
+              <w:left w:type="dxa" w:w="100"/>
+              <w:bottom w:type="dxa" w:w="40"/>
+              <w:right w:type="dxa" w:w="100"/>
+            </w:tcMar>
+            <w:vAlign w:val="center"/>
+          </w:tcPr>
+          <w:p>
+            <w:pPr>
+              <w:keepNext w:val="false"/>
+              <w:spacing w:after="0" w:line="252"/>
+              <w:jc w:val="left"/>
+            </w:pPr>
+            <w:r>
+              <w:rPr>
+                <w:rFonts w:ascii="Arial" w:cs="Arial" w:eastAsia="Arial" w:hAnsi="Arial"/>
+                <w:color w:val="1C1B16"/>
+                <w:sz w:val="18"/>
+                <w:szCs w:val="18"/>
+              </w:rPr>
+              <w:t xml:space="preserve">Company</w:t>
+            </w:r>
+          </w:p>
+        </w:tc>
+        <w:tc>
+          <w:tcPr>
+            <w:tcW w:type="dxa" w:w="8300"/>
+            <w:tcBorders>
+              <w:top w:val="single" w:color="D5D0C4" w:sz="4"/>
+              <w:left w:val="single" w:color="D5D0C4" w:sz="4"/>
+              <w:bottom w:val="single" w:color="D5D0C4" w:sz="4"/>
+              <w:right w:val="single" w:color="D5D0C4" w:sz="4"/>
+            </w:tcBorders>
+            <w:tcMar>
+              <w:top w:type="dxa" w:w="40"/>
+              <w:left w:type="dxa" w:w="100"/>
+              <w:bottom w:type="dxa" w:w="40"/>
+              <w:right w:type="dxa" w:w="100"/>
+            </w:tcMar>
+            <w:vAlign w:val="center"/>
+          </w:tcPr>
+          <w:p>
+            <w:pPr>
+              <w:keepNext w:val="false"/>
+              <w:spacing w:after="0" w:line="252"/>
+              <w:jc w:val="left"/>
+            </w:pPr>
+            <w:r>
+              <w:rPr>
+                <w:rFonts w:ascii="Arial" w:cs="Arial" w:eastAsia="Arial" w:hAnsi="Arial"/>
+                <w:b w:val="false"/>
+                <w:bCs w:val="false"/>
+                <w:color w:val="1C1B16"/>
+                <w:sz w:val="18"/>
+                <w:szCs w:val="18"/>
+              </w:rPr>
+              <w:t xml:space="preserve">Every item is set inside Kalpa Retail, where you work as a trainee engineer in the data and AI team of its Global Capability Centre. Meera Raghavan is its CEO, Anand Iyer its finance controller and Kavya Nair a senior analyst in its data team; Marketing and Finance appear by function, and every number an item needs is on the page.</w:t>
             </w:r>
           </w:p>
         </w:tc>
@@ -3917,7 +3992,7 @@
                 <w:sz w:val="18"/>
                 <w:szCs w:val="18"/>
               </w:rPr>
-              <w:t xml:space="preserve">  ·  Complete it</w:t>
+              <w:t xml:space="preserve">  ·  Complete the definition</w:t>
             </w:r>
           </w:p>
           <w:p>
@@ -4013,7 +4088,7 @@
                 <w:sz w:val="18"/>
                 <w:szCs w:val="18"/>
               </w:rPr>
-              <w:t xml:space="preserve">  ·  Complete it</w:t>
+              <w:t xml:space="preserve">  ·  Name the mechanism</w:t>
             </w:r>
           </w:p>
           <w:p>
@@ -4109,7 +4184,7 @@
                 <w:sz w:val="18"/>
                 <w:szCs w:val="18"/>
               </w:rPr>
-              <w:t xml:space="preserve">  ·  True or false</w:t>
+              <w:t xml:space="preserve">  ·  Read a p-value claim</w:t>
             </w:r>
           </w:p>
           <w:p>
@@ -4205,7 +4280,7 @@
                 <w:sz w:val="18"/>
                 <w:szCs w:val="18"/>
               </w:rPr>
-              <w:t xml:space="preserve">  ·  True or false</w:t>
+              <w:t xml:space="preserve">  ·  Test a claim on averages</w:t>
             </w:r>
           </w:p>
           <w:p>
@@ -4301,7 +4376,7 @@
                 <w:sz w:val="18"/>
                 <w:szCs w:val="18"/>
               </w:rPr>
-              <w:t xml:space="preserve">  ·  True or false</w:t>
+              <w:t xml:space="preserve">  ·  Judge a claim on significance</w:t>
             </w:r>
           </w:p>
           <w:p>
@@ -4397,7 +4472,7 @@
                 <w:sz w:val="18"/>
                 <w:szCs w:val="18"/>
               </w:rPr>
-              <w:t xml:space="preserve">  ·  True or false</w:t>
+              <w:t xml:space="preserve">  ·  Check a claim on duplicates</w:t>
             </w:r>
           </w:p>
           <w:p>
@@ -4493,7 +4568,7 @@
                 <w:sz w:val="18"/>
                 <w:szCs w:val="18"/>
               </w:rPr>
-              <w:t xml:space="preserve">  ·  True or false</w:t>
+              <w:t xml:space="preserve">  ·  Compare two counts</w:t>
             </w:r>
           </w:p>
           <w:p>
@@ -4589,7 +4664,7 @@
                 <w:sz w:val="18"/>
                 <w:szCs w:val="18"/>
               </w:rPr>
-              <w:t xml:space="preserve">  ·  True or false</w:t>
+              <w:t xml:space="preserve">  ·  Test a causal claim</w:t>
             </w:r>
           </w:p>
           <w:p>
@@ -4685,7 +4760,7 @@
                 <w:sz w:val="18"/>
                 <w:szCs w:val="18"/>
               </w:rPr>
-              <w:t xml:space="preserve">  ·  True or false</w:t>
+              <w:t xml:space="preserve">  ·  Judge an aggregate claim</w:t>
             </w:r>
           </w:p>
           <w:p>
@@ -4829,7 +4904,7 @@
                 <w:sz w:val="18"/>
                 <w:szCs w:val="18"/>
               </w:rPr>
-              <w:t xml:space="preserve">  ·  Choose one</w:t>
+              <w:t xml:space="preserve">  ·  Rule out a branch</w:t>
             </w:r>
           </w:p>
           <w:p>
@@ -5037,7 +5112,7 @@
                 <w:sz w:val="18"/>
                 <w:szCs w:val="18"/>
               </w:rPr>
-              <w:t xml:space="preserve">  ·  Choose one</w:t>
+              <w:t xml:space="preserve">  ·  Place the Rs 12 crore</w:t>
             </w:r>
           </w:p>
           <w:p>
@@ -5245,7 +5320,7 @@
                 <w:sz w:val="18"/>
                 <w:szCs w:val="18"/>
               </w:rPr>
-              <w:t xml:space="preserve">  ·  Choose one</w:t>
+              <w:t xml:space="preserve">  ·  Pick the first rung</w:t>
             </w:r>
           </w:p>
           <w:p>
@@ -5453,7 +5528,7 @@
                 <w:sz w:val="18"/>
                 <w:szCs w:val="18"/>
               </w:rPr>
-              <w:t xml:space="preserve">  ·  Choose one</w:t>
+              <w:t xml:space="preserve">  ·  Repair the comparison</w:t>
             </w:r>
           </w:p>
           <w:p>
@@ -5661,7 +5736,7 @@
                 <w:sz w:val="18"/>
                 <w:szCs w:val="18"/>
               </w:rPr>
-              <w:t xml:space="preserve">  ·  Choose one</w:t>
+              <w:t xml:space="preserve">  ·  Compare the levers</w:t>
             </w:r>
           </w:p>
           <w:p>
@@ -5869,7 +5944,7 @@
                 <w:sz w:val="18"/>
                 <w:szCs w:val="18"/>
               </w:rPr>
-              <w:t xml:space="preserve">  ·  Choose every correct option</w:t>
+              <w:t xml:space="preserve">  ·  Define a rate</w:t>
             </w:r>
           </w:p>
           <w:p>
@@ -6077,7 +6152,7 @@
                 <w:sz w:val="18"/>
                 <w:szCs w:val="18"/>
               </w:rPr>
-              <w:t xml:space="preserve">  ·  Choose every correct option</w:t>
+              <w:t xml:space="preserve">  ·  Find what fakes a drop</w:t>
             </w:r>
           </w:p>
           <w:p>
@@ -6818,7 +6893,7 @@
                 <w:sz w:val="18"/>
                 <w:szCs w:val="18"/>
               </w:rPr>
-              <w:t xml:space="preserve">  ·  Choose one</w:t>
+              <w:t xml:space="preserve">  ·  Compute a leaf</w:t>
             </w:r>
           </w:p>
           <w:p>
@@ -7026,7 +7101,7 @@
                 <w:sz w:val="18"/>
                 <w:szCs w:val="18"/>
               </w:rPr>
-              <w:t xml:space="preserve">  ·  Choose one</w:t>
+              <w:t xml:space="preserve">  ·  Find the branch that moved</w:t>
             </w:r>
           </w:p>
           <w:p>
@@ -7234,7 +7309,7 @@
                 <w:sz w:val="18"/>
                 <w:szCs w:val="18"/>
               </w:rPr>
-              <w:t xml:space="preserve">  ·  True or false</w:t>
+              <w:t xml:space="preserve">  ·  Test the decomposition</w:t>
             </w:r>
           </w:p>
           <w:p>
@@ -7330,7 +7405,7 @@
                 <w:sz w:val="18"/>
                 <w:szCs w:val="18"/>
               </w:rPr>
-              <w:t xml:space="preserve">  ·  Choose one</w:t>
+              <w:t xml:space="preserve">  ·  Answer Marketing's claim</w:t>
             </w:r>
           </w:p>
           <w:p>
@@ -7538,7 +7613,7 @@
                 <w:sz w:val="18"/>
                 <w:szCs w:val="18"/>
               </w:rPr>
-              <w:t xml:space="preserve">  ·  Put the steps in order</w:t>
+              <w:t xml:space="preserve">  ·  Order the ladder</w:t>
             </w:r>
           </w:p>
           <w:p>
@@ -7837,7 +7912,7 @@
                 <w:sz w:val="18"/>
                 <w:szCs w:val="18"/>
               </w:rPr>
-              <w:t xml:space="preserve">  ·  Choose one</w:t>
+              <w:t xml:space="preserve">  ·  Repair the crash</w:t>
             </w:r>
           </w:p>
           <w:p>
@@ -8045,7 +8120,7 @@
                 <w:sz w:val="18"/>
                 <w:szCs w:val="18"/>
               </w:rPr>
-              <w:t xml:space="preserve">  ·  Choose one</w:t>
+              <w:t xml:space="preserve">  ·  Decide what a duplicate is</w:t>
             </w:r>
           </w:p>
           <w:p>
@@ -8253,7 +8328,7 @@
                 <w:sz w:val="18"/>
                 <w:szCs w:val="18"/>
               </w:rPr>
-              <w:t xml:space="preserve">  ·  Choose one</w:t>
+              <w:t xml:space="preserve">  ·  Read the run's report</w:t>
             </w:r>
           </w:p>
           <w:p>
@@ -8461,7 +8536,7 @@
                 <w:sz w:val="18"/>
                 <w:szCs w:val="18"/>
               </w:rPr>
-              <w:t xml:space="preserve">  ·  Choose one</w:t>
+              <w:t xml:space="preserve">  ·  Choose the first move</w:t>
             </w:r>
           </w:p>
           <w:p>
@@ -8669,7 +8744,7 @@
                 <w:sz w:val="18"/>
                 <w:szCs w:val="18"/>
               </w:rPr>
-              <w:t xml:space="preserve">  ·  Choose every correct option</w:t>
+              <w:t xml:space="preserve">  ·  Treat a missing value</w:t>
             </w:r>
           </w:p>
           <w:p>
@@ -8877,7 +8952,7 @@
                 <w:sz w:val="18"/>
                 <w:szCs w:val="18"/>
               </w:rPr>
-              <w:t xml:space="preserve">  ·  Choose every correct option</w:t>
+              <w:t xml:space="preserve">  ·  Define the profile</w:t>
             </w:r>
           </w:p>
           <w:p>
@@ -9548,7 +9623,7 @@
                 <w:sz w:val="18"/>
                 <w:szCs w:val="18"/>
               </w:rPr>
-              <w:t xml:space="preserve">  ·  Complete it</w:t>
+              <w:t xml:space="preserve">  ·  Count the clean rows</w:t>
             </w:r>
           </w:p>
           <w:p>
@@ -9644,7 +9719,7 @@
                 <w:sz w:val="18"/>
                 <w:szCs w:val="18"/>
               </w:rPr>
-              <w:t xml:space="preserve">  ·  Complete it</w:t>
+              <w:t xml:space="preserve">  ·  Size the rejects log</w:t>
             </w:r>
           </w:p>
           <w:p>
@@ -9740,7 +9815,7 @@
                 <w:sz w:val="18"/>
                 <w:szCs w:val="18"/>
               </w:rPr>
-              <w:t xml:space="preserve">  ·  Choose one</w:t>
+              <w:t xml:space="preserve">  ·  Update the comparison</w:t>
             </w:r>
           </w:p>
           <w:p>
@@ -9948,7 +10023,7 @@
                 <w:sz w:val="18"/>
                 <w:szCs w:val="18"/>
               </w:rPr>
-              <w:t xml:space="preserve">  ·  Put the steps in order</w:t>
+              <w:t xml:space="preserve">  ·  Order the cleaning pass</w:t>
             </w:r>
           </w:p>
           <w:p>
@@ -10219,7 +10294,7 @@
                 <w:sz w:val="18"/>
                 <w:szCs w:val="18"/>
               </w:rPr>
-              <w:t xml:space="preserve">  ·  True or false</w:t>
+              <w:t xml:space="preserve">  ·  Predict the comparison</w:t>
             </w:r>
           </w:p>
           <w:p>
@@ -10428,7 +10503,7 @@
                 <w:sz w:val="18"/>
                 <w:szCs w:val="18"/>
               </w:rPr>
-              <w:t xml:space="preserve">  ·  Choose one</w:t>
+              <w:t xml:space="preserve">  ·  Choose the count to trust</w:t>
             </w:r>
           </w:p>
           <w:p>
@@ -10636,7 +10711,7 @@
                 <w:sz w:val="18"/>
                 <w:szCs w:val="18"/>
               </w:rPr>
-              <w:t xml:space="preserve">  ·  Choose one</w:t>
+              <w:t xml:space="preserve">  ·  Judge the reconciliation</w:t>
             </w:r>
           </w:p>
           <w:p>
@@ -11267,7 +11342,7 @@
                 <w:sz w:val="18"/>
                 <w:szCs w:val="18"/>
               </w:rPr>
-              <w:t xml:space="preserve">  ·  Complete it</w:t>
+              <w:t xml:space="preserve">  ·  Count per customer</w:t>
             </w:r>
           </w:p>
           <w:p>
@@ -11363,7 +11438,7 @@
                 <w:sz w:val="18"/>
                 <w:szCs w:val="18"/>
               </w:rPr>
-              <w:t xml:space="preserve">  ·  Complete it</w:t>
+              <w:t xml:space="preserve">  ·  Price the average order</w:t>
             </w:r>
           </w:p>
           <w:p>
@@ -11459,7 +11534,7 @@
                 <w:sz w:val="18"/>
                 <w:szCs w:val="18"/>
               </w:rPr>
-              <w:t xml:space="preserve">  ·  Choose one</w:t>
+              <w:t xml:space="preserve">  ·  Reply in the room</w:t>
             </w:r>
           </w:p>
           <w:p>
@@ -11869,7 +11944,7 @@
                 <w:sz w:val="18"/>
                 <w:szCs w:val="18"/>
               </w:rPr>
-              <w:t xml:space="preserve">  ·  Choose one</w:t>
+              <w:t xml:space="preserve">  ·  Read the discount count</w:t>
             </w:r>
           </w:p>
           <w:p>
@@ -12077,7 +12152,7 @@
                 <w:sz w:val="18"/>
                 <w:szCs w:val="18"/>
               </w:rPr>
-              <w:t xml:space="preserve">  ·  Choose one</w:t>
+              <w:t xml:space="preserve">  ·  Predict what result holds</w:t>
             </w:r>
           </w:p>
           <w:p>
@@ -12487,7 +12562,7 @@
                 <w:sz w:val="18"/>
                 <w:szCs w:val="18"/>
               </w:rPr>
-              <w:t xml:space="preserve">  ·  Choose one</w:t>
+              <w:t xml:space="preserve">  ·  Trace the summary</w:t>
             </w:r>
           </w:p>
           <w:p>
@@ -12876,7 +12951,7 @@
                 <w:sz w:val="18"/>
                 <w:szCs w:val="18"/>
               </w:rPr>
-              <w:t xml:space="preserve">  ·  Choose one</w:t>
+              <w:t xml:space="preserve">  ·  Predict the output</w:t>
             </w:r>
           </w:p>
           <w:p>
@@ -13132,7 +13207,7 @@
                 <w:sz w:val="18"/>
                 <w:szCs w:val="18"/>
               </w:rPr>
-              <w:t xml:space="preserve">  ·  Choose one</w:t>
+              <w:t xml:space="preserve">  ·  Read the shuffles</w:t>
             </w:r>
           </w:p>
           <w:p>
@@ -13340,7 +13415,7 @@
                 <w:sz w:val="18"/>
                 <w:szCs w:val="18"/>
               </w:rPr>
-              <w:t xml:space="preserve">  ·  Choose one</w:t>
+              <w:t xml:space="preserve">  ·  Advise Meera</w:t>
             </w:r>
           </w:p>
           <w:p>
@@ -13548,7 +13623,7 @@
                 <w:sz w:val="18"/>
                 <w:szCs w:val="18"/>
               </w:rPr>
-              <w:t xml:space="preserve">  ·  Choose every correct option</w:t>
+              <w:t xml:space="preserve">  ·  Design a fair test</w:t>
             </w:r>
           </w:p>
           <w:p>
@@ -13756,7 +13831,7 @@
                 <w:sz w:val="18"/>
                 <w:szCs w:val="18"/>
               </w:rPr>
-              <w:t xml:space="preserve">  ·  Choose every correct option</w:t>
+              <w:t xml:space="preserve">  ·  Check four p-value statements</w:t>
             </w:r>
           </w:p>
           <w:p>
@@ -14352,7 +14427,7 @@
                 <w:sz w:val="18"/>
                 <w:szCs w:val="18"/>
               </w:rPr>
-              <w:t xml:space="preserve">  ·  Choose one</w:t>
+              <w:t xml:space="preserve">  ·  Name the pattern</w:t>
             </w:r>
           </w:p>
           <w:p>
@@ -14560,7 +14635,7 @@
                 <w:sz w:val="18"/>
                 <w:szCs w:val="18"/>
               </w:rPr>
-              <w:t xml:space="preserve">  ·  True or false</w:t>
+              <w:t xml:space="preserve">  ·  Judge frequency's role</w:t>
             </w:r>
           </w:p>
           <w:p>
@@ -14656,7 +14731,7 @@
                 <w:sz w:val="18"/>
                 <w:szCs w:val="18"/>
               </w:rPr>
-              <w:t xml:space="preserve">  ·  Choose one</w:t>
+              <w:t xml:space="preserve">  ·  Advise on Diwali</w:t>
             </w:r>
           </w:p>
           <w:p>
@@ -14912,7 +14987,7 @@
                 <w:sz w:val="18"/>
                 <w:szCs w:val="18"/>
               </w:rPr>
-              <w:t xml:space="preserve">  ·  Choose one</w:t>
+              <w:t xml:space="preserve">  ·  Read the two averages</w:t>
             </w:r>
           </w:p>
           <w:p>
@@ -15120,7 +15195,7 @@
                 <w:sz w:val="18"/>
                 <w:szCs w:val="18"/>
               </w:rPr>
-              <w:t xml:space="preserve">  ·  Work it out</w:t>
+              <w:t xml:space="preserve">  ·  Reason with numbers</w:t>
             </w:r>
           </w:p>
           <w:p>
@@ -15292,7 +15367,7 @@
                 <w:sz w:val="18"/>
                 <w:szCs w:val="18"/>
               </w:rPr>
-              <w:t xml:space="preserve">  ·  Work it out</w:t>
+              <w:t xml:space="preserve">  ·  Compute median and mean</w:t>
             </w:r>
           </w:p>
           <w:p>
@@ -15464,7 +15539,7 @@
                 <w:sz w:val="18"/>
                 <w:szCs w:val="18"/>
               </w:rPr>
-              <w:t xml:space="preserve">  ·  Work it out</w:t>
+              <w:t xml:space="preserve">  ·  Size the change</w:t>
             </w:r>
           </w:p>
           <w:p>
@@ -15636,7 +15711,7 @@
                 <w:sz w:val="18"/>
                 <w:szCs w:val="18"/>
               </w:rPr>
-              <w:t xml:space="preserve">  ·  Work it out</w:t>
+              <w:t xml:space="preserve">  ·  Read p off the shuffles</w:t>
             </w:r>
           </w:p>
           <w:p>
@@ -15808,7 +15883,7 @@
                 <w:sz w:val="18"/>
                 <w:szCs w:val="18"/>
               </w:rPr>
-              <w:t xml:space="preserve">  ·  Work it out</w:t>
+              <w:t xml:space="preserve">  ·  Build revenue from the tree</w:t>
             </w:r>
           </w:p>
           <w:p>

</xml_diff>

<commit_message>
Saturday papers: name Anand Iyer by his work, and record the CFO against finance controller conflict
The tracker's Week 1 and Week 2 rows and the spine say CFO; client zero v2.2 says finance
controller. Both Company rows and Week 1's Part 3 opening now read "answers for Finance's books",
true under either title, and facts.yaml records the conflict as anand-title for the Programme Head.

Co-Authored-By: Claude Opus 5.5 <noreply@anthropic.com>
Claude-Session: https://claude.ai/code/session_01P7zaoR4dQ5pzBFnsX549JQ
</commit_message>
<xml_diff>
--- a/content/W01/SAT/paper/C2_W01_SAT_recap_paper_STUDENT.docx
+++ b/content/W01/SAT/paper/C2_W01_SAT_recap_paper_STUDENT.docx
@@ -629,7 +629,7 @@
                 <w:sz w:val="18"/>
                 <w:szCs w:val="18"/>
               </w:rPr>
-              <w:t xml:space="preserve">Every item is set inside Kalpa Retail, where you work as a trainee engineer in the data and AI team of its Global Capability Centre. Meera Raghavan is its CEO, Anand Iyer its finance controller and Kavya Nair a senior analyst in its data team; Marketing and Finance appear by function, and every number an item needs is on the page.</w:t>
+              <w:t xml:space="preserve">Every item is set inside Kalpa Retail, where you work as a trainee engineer in the data and AI team of its Global Capability Centre. Meera Raghavan is its CEO, Anand Iyer answers for Finance's books, and Kavya Nair is a senior analyst in its data team; Marketing and Finance appear by function, and every number an item needs is on the page.</w:t>
             </w:r>
           </w:p>
         </w:tc>
@@ -8130,7 +8130,7 @@
           <w:sz w:val="21"/>
           <w:szCs w:val="21"/>
         </w:rPr>
-        <w:t xml:space="preserve">"Your dashboard says Q1 was Rs 2.1 crore. Our books say 1.9." Anand Iyer, the finance controller, wrote that back to all on Tuesday's finding, and the ERP export behind the dashboard is the file on your desk.</w:t>
+        <w:t xml:space="preserve">"Your dashboard says Q1 was Rs 2.1 crore. Our books say 1.9." Anand Iyer, who answers for Finance's books, wrote that back to all on Tuesday's finding, and the ERP export behind the dashboard is the file on your desk.</w:t>
       </w:r>
     </w:p>
     <w:tbl>

</xml_diff>

<commit_message>
Record the requester's two decisions: Anand Iyer is the finance controller, and all thirty Saturday edits are accepted
facts.yaml closes anand-finance-controller and saturday-edits-w1-w2 and settles the anand-title
conflict; every Week 1 and Week 2 entry in paper_edits.yaml is now accepted. Both papers name
Anand as the finance controller again, the spine's bridge line follows, the sync rewrote the
derived pages, and both Saturdays' Word files and keys are rebuilt.

Co-Authored-By: Claude Opus 5.5 <noreply@anthropic.com>
Claude-Session: https://claude.ai/code/session_01P7zaoR4dQ5pzBFnsX549JQ
</commit_message>
<xml_diff>
--- a/content/W01/SAT/paper/C2_W01_SAT_recap_paper_STUDENT.docx
+++ b/content/W01/SAT/paper/C2_W01_SAT_recap_paper_STUDENT.docx
@@ -629,7 +629,7 @@
                 <w:sz w:val="18"/>
                 <w:szCs w:val="18"/>
               </w:rPr>
-              <w:t xml:space="preserve">Every item is set inside Kalpa Retail, where you work as a trainee engineer in the data and AI team of its Global Capability Centre. Meera Raghavan is its CEO, Anand Iyer answers for Finance's books, and Kavya Nair is a senior analyst in its data team; Marketing and Finance appear by function, and every number an item needs is on the page.</w:t>
+              <w:t xml:space="preserve">Every item is set inside Kalpa Retail, where you work as a trainee engineer in the data and AI team of its Global Capability Centre. Meera Raghavan is its CEO, Anand Iyer its finance controller and Kavya Nair a senior analyst in its data team; Marketing and Finance appear by function, and every number an item needs is on the page.</w:t>
             </w:r>
           </w:p>
         </w:tc>
@@ -8130,7 +8130,7 @@
           <w:sz w:val="21"/>
           <w:szCs w:val="21"/>
         </w:rPr>
-        <w:t xml:space="preserve">"Your dashboard says Q1 was Rs 2.1 crore. Our books say 1.9." Anand Iyer, who answers for Finance's books, wrote that back to all on Tuesday's finding, and the ERP export behind the dashboard is the file on your desk.</w:t>
+        <w:t xml:space="preserve">"Your dashboard says Q1 was Rs 2.1 crore. Our books say 1.9." Anand Iyer, the finance controller, wrote that back to all on Tuesday's finding, and the ERP export behind the dashboard is the file on your desk.</w:t>
       </w:r>
     </w:p>
     <w:tbl>

</xml_diff>

<commit_message>
Saturday builder names word banks in a paper's rules only when it prints one; the Week 1 and Week 2 papers re-rendered on the new builder
Co-Authored-By: Claude Opus 5.5 <noreply@anthropic.com>
Claude-Session: https://claude.ai/code/session_01P7zaoR4dQ5pzBFnsX549JQ
</commit_message>
<xml_diff>
--- a/content/W01/SAT/paper/C2_W01_SAT_recap_paper_STUDENT.docx
+++ b/content/W01/SAT/paper/C2_W01_SAT_recap_paper_STUDENT.docx
@@ -404,7 +404,7 @@
                 <w:sz w:val="18"/>
                 <w:szCs w:val="18"/>
               </w:rPr>
-              <w:t xml:space="preserve">Every answer goes on the answer sheet at the back, which is the page that is marked: one box for a lettered item, every correct box for a starred one, T or F for a statement, and the word, the number or the letters in order in the space. A wrong answer costs nothing, so answer every item.</w:t>
+              <w:t xml:space="preserve">Every answer goes on the answer sheet at the back, which is the page that is marked: one box for a lettered item, every correct box for a starred one, T or F for a statement, and the number or the letters in order in the space. A wrong answer costs nothing, so answer every item.</w:t>
             </w:r>
           </w:p>
         </w:tc>
@@ -27388,7 +27388,7 @@
           <w:sz w:val="22"/>
           <w:szCs w:val="22"/>
         </w:rPr>
-        <w:t xml:space="preserve">Words, numbers and orders: one answer per space</w:t>
+        <w:t xml:space="preserve">Letters, words, numbers and orders: one answer per space</w:t>
       </w:r>
     </w:p>
     <w:tbl>

</xml_diff>

<commit_message>
W01 SAT: the revenue tree drawn top to bottom, so Part 1's opening, the tree and Q1 share a page
Co-Authored-By: Claude Opus 5.5 <noreply@anthropic.com>
Claude-Session: https://claude.ai/code/session_01K8RZ1KXh1k8mKVCEBq4phk
</commit_message>
<xml_diff>
--- a/content/W01/SAT/paper/C2_W01_SAT_recap_paper_STUDENT.docx
+++ b/content/W01/SAT/paper/C2_W01_SAT_recap_paper_STUDENT.docx
@@ -3688,7 +3688,7 @@
             <w:r>
               <w:drawing>
                 <wp:inline distT="0" distB="0" distL="0" distR="0">
-                  <wp:extent cx="3619500" cy="5476875"/>
+                  <wp:extent cx="5905500" cy="1333500"/>
                   <wp:effectExtent t="0" r="0" b="0" l="0"/>
                   <wp:docPr id="1" name="" descr="" title=""/>
                   <wp:cNvGraphicFramePr>
@@ -3713,7 +3713,7 @@
                         <pic:spPr bwMode="auto">
                           <a:xfrm>
                             <a:off x="0" y="0"/>
-                            <a:ext cx="3619500" cy="5476875"/>
+                            <a:ext cx="5905500" cy="1333500"/>
                           </a:xfrm>
                           <a:prstGeom prst="rect">
                             <a:avLst/>

</xml_diff>